<commit_message>
Cotización: agrega comparación contra la app de facturas
Co-Authored-By: Claude Opus 5.5 (1M context) <noreply@anthropic.com>
</commit_message>
<xml_diff>
--- a/cotizacionSistema v1/Cotizacion-sistema-ImpleGas-v1.docx
+++ b/cotizacionSistema v1/Cotizacion-sistema-ImpleGas-v1.docx
@@ -2990,6 +2990,1287 @@
           <w:szCs w:val="19"/>
         </w:rPr>
         <w:t xml:space="preserve">En la Opción A el total no incluye cambios posteriores, que se cobran aparte.</w:t>
+      </w:r>
+    </w:p>
+    <w:p>
+      <w:r>
+        <w:br w:type="page"/>
+      </w:r>
+    </w:p>
+    <w:p>
+      <w:pPr>
+        <w:keepNext/>
+        <w:pBdr>
+          <w:bottom w:val="single" w:color="2F9A3F" w:sz="8" w:space="4"/>
+        </w:pBdr>
+        <w:spacing w:before="0" w:after="140"/>
+      </w:pPr>
+      <w:r>
+        <w:rPr>
+          <w:rFonts w:ascii="Calibri" w:cs="Calibri" w:eastAsia="Calibri" w:hAnsi="Calibri"/>
+          <w:b/>
+          <w:bCs/>
+          <w:color w:val="2F9A3F"/>
+          <w:sz w:val="24"/>
+          <w:szCs w:val="24"/>
+        </w:rPr>
+        <w:t xml:space="preserve">SISTEMA A LA MEDIDA VS. APP DE FACTURAS</w:t>
+      </w:r>
+    </w:p>
+    <w:p>
+      <w:pPr>
+        <w:spacing w:after="120" w:before="0" w:line="276"/>
+      </w:pPr>
+      <w:r>
+        <w:rPr>
+          <w:rFonts w:ascii="Calibri" w:cs="Calibri" w:eastAsia="Calibri" w:hAnsi="Calibri"/>
+          <w:sz w:val="21"/>
+          <w:szCs w:val="21"/>
+        </w:rPr>
+        <w:t xml:space="preserve">Comparación con una app de facturas por suscripción ($195 a la semana o $2,249 al año). La app es más barata para hacer documentos; el sistema a la medida cotiza exactamente como trabaja ImpleGas e incluye la página web y el soporte.</w:t>
+      </w:r>
+    </w:p>
+    <w:tbl>
+      <w:tblPr>
+        <w:tblW w:type="dxa" w:w="9360"/>
+        <w:tblBorders>
+          <w:top w:val="single" w:color="auto" w:sz="4"/>
+          <w:left w:val="single" w:color="auto" w:sz="4"/>
+          <w:bottom w:val="single" w:color="auto" w:sz="4"/>
+          <w:right w:val="single" w:color="auto" w:sz="4"/>
+          <w:insideH w:val="single" w:color="auto" w:sz="4"/>
+          <w:insideV w:val="single" w:color="auto" w:sz="4"/>
+        </w:tblBorders>
+        <w:tblLayout w:type="fixed"/>
+      </w:tblPr>
+      <w:tblGrid>
+        <w:gridCol w:w="2160"/>
+        <w:gridCol w:w="3600"/>
+        <w:gridCol w:w="3600"/>
+      </w:tblGrid>
+      <w:tr>
+        <w:trPr>
+          <w:tblHeader/>
+        </w:trPr>
+        <w:tc>
+          <w:tcPr>
+            <w:tcW w:type="dxa" w:w="2160"/>
+            <w:tcBorders>
+              <w:top w:val="single" w:color="D9DDE1" w:sz="4"/>
+              <w:left w:val="single" w:color="D9DDE1" w:sz="4"/>
+              <w:bottom w:val="single" w:color="D9DDE1" w:sz="4"/>
+              <w:right w:val="single" w:color="D9DDE1" w:sz="4"/>
+            </w:tcBorders>
+            <w:shd w:fill="2F9A3F" w:color="auto" w:val="clear"/>
+            <w:tcMar>
+              <w:top w:type="dxa" w:w="90"/>
+              <w:left w:type="dxa" w:w="140"/>
+              <w:bottom w:type="dxa" w:w="90"/>
+              <w:right w:type="dxa" w:w="140"/>
+            </w:tcMar>
+            <w:vAlign w:val="center"/>
+          </w:tcPr>
+          <w:p>
+            <w:pPr>
+              <w:spacing w:after="0" w:line="264"/>
+            </w:pPr>
+            <w:r>
+              <w:rPr>
+                <w:rFonts w:ascii="Calibri" w:cs="Calibri" w:eastAsia="Calibri" w:hAnsi="Calibri"/>
+                <w:b/>
+                <w:bCs/>
+                <w:color w:val="FFFFFF"/>
+                <w:sz w:val="20"/>
+                <w:szCs w:val="20"/>
+              </w:rPr>
+              <w:t xml:space="preserve">Punto</w:t>
+            </w:r>
+          </w:p>
+        </w:tc>
+        <w:tc>
+          <w:tcPr>
+            <w:tcW w:type="dxa" w:w="3600"/>
+            <w:tcBorders>
+              <w:top w:val="single" w:color="D9DDE1" w:sz="4"/>
+              <w:left w:val="single" w:color="D9DDE1" w:sz="4"/>
+              <w:bottom w:val="single" w:color="D9DDE1" w:sz="4"/>
+              <w:right w:val="single" w:color="D9DDE1" w:sz="4"/>
+            </w:tcBorders>
+            <w:shd w:fill="2F9A3F" w:color="auto" w:val="clear"/>
+            <w:tcMar>
+              <w:top w:type="dxa" w:w="90"/>
+              <w:left w:type="dxa" w:w="140"/>
+              <w:bottom w:type="dxa" w:w="90"/>
+              <w:right w:type="dxa" w:w="140"/>
+            </w:tcMar>
+            <w:vAlign w:val="center"/>
+          </w:tcPr>
+          <w:p>
+            <w:pPr>
+              <w:spacing w:after="0" w:line="264"/>
+            </w:pPr>
+            <w:r>
+              <w:rPr>
+                <w:rFonts w:ascii="Calibri" w:cs="Calibri" w:eastAsia="Calibri" w:hAnsi="Calibri"/>
+                <w:b/>
+                <w:bCs/>
+                <w:color w:val="FFFFFF"/>
+                <w:sz w:val="20"/>
+                <w:szCs w:val="20"/>
+              </w:rPr>
+              <w:t xml:space="preserve">App de facturas</w:t>
+            </w:r>
+          </w:p>
+        </w:tc>
+        <w:tc>
+          <w:tcPr>
+            <w:tcW w:type="dxa" w:w="3600"/>
+            <w:tcBorders>
+              <w:top w:val="single" w:color="D9DDE1" w:sz="4"/>
+              <w:left w:val="single" w:color="D9DDE1" w:sz="4"/>
+              <w:bottom w:val="single" w:color="D9DDE1" w:sz="4"/>
+              <w:right w:val="single" w:color="D9DDE1" w:sz="4"/>
+            </w:tcBorders>
+            <w:shd w:fill="2F9A3F" w:color="auto" w:val="clear"/>
+            <w:tcMar>
+              <w:top w:type="dxa" w:w="90"/>
+              <w:left w:type="dxa" w:w="140"/>
+              <w:bottom w:type="dxa" w:w="90"/>
+              <w:right w:type="dxa" w:w="140"/>
+            </w:tcMar>
+            <w:vAlign w:val="center"/>
+          </w:tcPr>
+          <w:p>
+            <w:pPr>
+              <w:spacing w:after="0" w:line="264"/>
+            </w:pPr>
+            <w:r>
+              <w:rPr>
+                <w:rFonts w:ascii="Calibri" w:cs="Calibri" w:eastAsia="Calibri" w:hAnsi="Calibri"/>
+                <w:b/>
+                <w:bCs/>
+                <w:color w:val="FFFFFF"/>
+                <w:sz w:val="20"/>
+                <w:szCs w:val="20"/>
+              </w:rPr>
+              <w:t xml:space="preserve">Sistema ImpleGas</w:t>
+            </w:r>
+          </w:p>
+        </w:tc>
+      </w:tr>
+      <w:tr>
+        <w:trPr>
+          <w:cantSplit/>
+        </w:trPr>
+        <w:tc>
+          <w:tcPr>
+            <w:tcW w:type="dxa" w:w="2160"/>
+            <w:tcBorders>
+              <w:top w:val="single" w:color="D9DDE1" w:sz="4"/>
+              <w:left w:val="single" w:color="D9DDE1" w:sz="4"/>
+              <w:bottom w:val="single" w:color="D9DDE1" w:sz="4"/>
+              <w:right w:val="single" w:color="D9DDE1" w:sz="4"/>
+            </w:tcBorders>
+            <w:tcMar>
+              <w:top w:type="dxa" w:w="90"/>
+              <w:left w:type="dxa" w:w="140"/>
+              <w:bottom w:type="dxa" w:w="90"/>
+              <w:right w:type="dxa" w:w="140"/>
+            </w:tcMar>
+            <w:vAlign w:val="center"/>
+          </w:tcPr>
+          <w:p>
+            <w:pPr>
+              <w:spacing w:after="0" w:line="264"/>
+            </w:pPr>
+            <w:r>
+              <w:rPr>
+                <w:rFonts w:ascii="Calibri" w:cs="Calibri" w:eastAsia="Calibri" w:hAnsi="Calibri"/>
+                <w:b/>
+                <w:bCs/>
+                <w:sz w:val="20"/>
+                <w:szCs w:val="20"/>
+              </w:rPr>
+              <w:t xml:space="preserve">Costo</w:t>
+            </w:r>
+          </w:p>
+        </w:tc>
+        <w:tc>
+          <w:tcPr>
+            <w:tcW w:type="dxa" w:w="3600"/>
+            <w:tcBorders>
+              <w:top w:val="single" w:color="D9DDE1" w:sz="4"/>
+              <w:left w:val="single" w:color="D9DDE1" w:sz="4"/>
+              <w:bottom w:val="single" w:color="D9DDE1" w:sz="4"/>
+              <w:right w:val="single" w:color="D9DDE1" w:sz="4"/>
+            </w:tcBorders>
+            <w:tcMar>
+              <w:top w:type="dxa" w:w="90"/>
+              <w:left w:type="dxa" w:w="140"/>
+              <w:bottom w:type="dxa" w:w="90"/>
+              <w:right w:type="dxa" w:w="140"/>
+            </w:tcMar>
+            <w:vAlign w:val="center"/>
+          </w:tcPr>
+          <w:p>
+            <w:pPr>
+              <w:spacing w:after="0" w:line="264"/>
+            </w:pPr>
+            <w:r>
+              <w:rPr>
+                <w:rFonts w:ascii="Calibri" w:cs="Calibri" w:eastAsia="Calibri" w:hAnsi="Calibri"/>
+                <w:sz w:val="20"/>
+                <w:szCs w:val="20"/>
+              </w:rPr>
+              <w:t xml:space="preserve">$2,249 al año (≈ $187 al mes) o $195 a la semana</w:t>
+            </w:r>
+          </w:p>
+        </w:tc>
+        <w:tc>
+          <w:tcPr>
+            <w:tcW w:type="dxa" w:w="3600"/>
+            <w:tcBorders>
+              <w:top w:val="single" w:color="D9DDE1" w:sz="4"/>
+              <w:left w:val="single" w:color="D9DDE1" w:sz="4"/>
+              <w:bottom w:val="single" w:color="D9DDE1" w:sz="4"/>
+              <w:right w:val="single" w:color="D9DDE1" w:sz="4"/>
+            </w:tcBorders>
+            <w:tcMar>
+              <w:top w:type="dxa" w:w="90"/>
+              <w:left w:type="dxa" w:w="140"/>
+              <w:bottom w:type="dxa" w:w="90"/>
+              <w:right w:type="dxa" w:w="140"/>
+            </w:tcMar>
+            <w:vAlign w:val="center"/>
+          </w:tcPr>
+          <w:p>
+            <w:pPr>
+              <w:spacing w:after="0" w:line="264"/>
+            </w:pPr>
+            <w:r>
+              <w:rPr>
+                <w:rFonts w:ascii="Calibri" w:cs="Calibri" w:eastAsia="Calibri" w:hAnsi="Calibri"/>
+                <w:sz w:val="20"/>
+                <w:szCs w:val="20"/>
+              </w:rPr>
+              <w:t xml:space="preserve">Opción A o B de esta cotización</w:t>
+            </w:r>
+          </w:p>
+        </w:tc>
+      </w:tr>
+      <w:tr>
+        <w:trPr>
+          <w:cantSplit/>
+        </w:trPr>
+        <w:tc>
+          <w:tcPr>
+            <w:tcW w:type="dxa" w:w="2160"/>
+            <w:tcBorders>
+              <w:top w:val="single" w:color="D9DDE1" w:sz="4"/>
+              <w:left w:val="single" w:color="D9DDE1" w:sz="4"/>
+              <w:bottom w:val="single" w:color="D9DDE1" w:sz="4"/>
+              <w:right w:val="single" w:color="D9DDE1" w:sz="4"/>
+            </w:tcBorders>
+            <w:shd w:fill="F3F4F6" w:color="auto" w:val="clear"/>
+            <w:tcMar>
+              <w:top w:type="dxa" w:w="90"/>
+              <w:left w:type="dxa" w:w="140"/>
+              <w:bottom w:type="dxa" w:w="90"/>
+              <w:right w:type="dxa" w:w="140"/>
+            </w:tcMar>
+            <w:vAlign w:val="center"/>
+          </w:tcPr>
+          <w:p>
+            <w:pPr>
+              <w:spacing w:after="0" w:line="264"/>
+            </w:pPr>
+            <w:r>
+              <w:rPr>
+                <w:rFonts w:ascii="Calibri" w:cs="Calibri" w:eastAsia="Calibri" w:hAnsi="Calibri"/>
+                <w:b/>
+                <w:bCs/>
+                <w:sz w:val="20"/>
+                <w:szCs w:val="20"/>
+              </w:rPr>
+              <w:t xml:space="preserve">Formato del PDF</w:t>
+            </w:r>
+          </w:p>
+        </w:tc>
+        <w:tc>
+          <w:tcPr>
+            <w:tcW w:type="dxa" w:w="3600"/>
+            <w:tcBorders>
+              <w:top w:val="single" w:color="D9DDE1" w:sz="4"/>
+              <w:left w:val="single" w:color="D9DDE1" w:sz="4"/>
+              <w:bottom w:val="single" w:color="D9DDE1" w:sz="4"/>
+              <w:right w:val="single" w:color="D9DDE1" w:sz="4"/>
+            </w:tcBorders>
+            <w:shd w:fill="F3F4F6" w:color="auto" w:val="clear"/>
+            <w:tcMar>
+              <w:top w:type="dxa" w:w="90"/>
+              <w:left w:type="dxa" w:w="140"/>
+              <w:bottom w:type="dxa" w:w="90"/>
+              <w:right w:type="dxa" w:w="140"/>
+            </w:tcMar>
+            <w:vAlign w:val="center"/>
+          </w:tcPr>
+          <w:p>
+            <w:pPr>
+              <w:spacing w:after="0" w:line="264"/>
+            </w:pPr>
+            <w:r>
+              <w:rPr>
+                <w:rFonts w:ascii="Calibri" w:cs="Calibri" w:eastAsia="Calibri" w:hAnsi="Calibri"/>
+                <w:sz w:val="20"/>
+                <w:szCs w:val="20"/>
+              </w:rPr>
+              <w:t xml:space="preserve">Plantillas genéricas de la app</w:t>
+            </w:r>
+          </w:p>
+        </w:tc>
+        <w:tc>
+          <w:tcPr>
+            <w:tcW w:type="dxa" w:w="3600"/>
+            <w:tcBorders>
+              <w:top w:val="single" w:color="D9DDE1" w:sz="4"/>
+              <w:left w:val="single" w:color="D9DDE1" w:sz="4"/>
+              <w:bottom w:val="single" w:color="D9DDE1" w:sz="4"/>
+              <w:right w:val="single" w:color="D9DDE1" w:sz="4"/>
+            </w:tcBorders>
+            <w:shd w:fill="F3F4F6" w:color="auto" w:val="clear"/>
+            <w:tcMar>
+              <w:top w:type="dxa" w:w="90"/>
+              <w:left w:type="dxa" w:w="140"/>
+              <w:bottom w:type="dxa" w:w="90"/>
+              <w:right w:type="dxa" w:w="140"/>
+            </w:tcMar>
+            <w:vAlign w:val="center"/>
+          </w:tcPr>
+          <w:p>
+            <w:pPr>
+              <w:spacing w:after="0" w:line="264"/>
+            </w:pPr>
+            <w:r>
+              <w:rPr>
+                <w:rFonts w:ascii="Calibri" w:cs="Calibri" w:eastAsia="Calibri" w:hAnsi="Calibri"/>
+                <w:sz w:val="20"/>
+                <w:szCs w:val="20"/>
+              </w:rPr>
+              <w:t xml:space="preserve">El formato actual de ImpleGas, con logos por servicio, incluye, garantía y nota</w:t>
+            </w:r>
+          </w:p>
+        </w:tc>
+      </w:tr>
+      <w:tr>
+        <w:trPr>
+          <w:cantSplit/>
+        </w:trPr>
+        <w:tc>
+          <w:tcPr>
+            <w:tcW w:type="dxa" w:w="2160"/>
+            <w:tcBorders>
+              <w:top w:val="single" w:color="D9DDE1" w:sz="4"/>
+              <w:left w:val="single" w:color="D9DDE1" w:sz="4"/>
+              <w:bottom w:val="single" w:color="D9DDE1" w:sz="4"/>
+              <w:right w:val="single" w:color="D9DDE1" w:sz="4"/>
+            </w:tcBorders>
+            <w:tcMar>
+              <w:top w:type="dxa" w:w="90"/>
+              <w:left w:type="dxa" w:w="140"/>
+              <w:bottom w:type="dxa" w:w="90"/>
+              <w:right w:type="dxa" w:w="140"/>
+            </w:tcMar>
+            <w:vAlign w:val="center"/>
+          </w:tcPr>
+          <w:p>
+            <w:pPr>
+              <w:spacing w:after="0" w:line="264"/>
+            </w:pPr>
+            <w:r>
+              <w:rPr>
+                <w:rFonts w:ascii="Calibri" w:cs="Calibri" w:eastAsia="Calibri" w:hAnsi="Calibri"/>
+                <w:b/>
+                <w:bCs/>
+                <w:sz w:val="20"/>
+                <w:szCs w:val="20"/>
+              </w:rPr>
+              <w:t xml:space="preserve">Bases por servicio</w:t>
+            </w:r>
+          </w:p>
+        </w:tc>
+        <w:tc>
+          <w:tcPr>
+            <w:tcW w:type="dxa" w:w="3600"/>
+            <w:tcBorders>
+              <w:top w:val="single" w:color="D9DDE1" w:sz="4"/>
+              <w:left w:val="single" w:color="D9DDE1" w:sz="4"/>
+              <w:bottom w:val="single" w:color="D9DDE1" w:sz="4"/>
+              <w:right w:val="single" w:color="D9DDE1" w:sz="4"/>
+            </w:tcBorders>
+            <w:tcMar>
+              <w:top w:type="dxa" w:w="90"/>
+              <w:left w:type="dxa" w:w="140"/>
+              <w:bottom w:type="dxa" w:w="90"/>
+              <w:right w:type="dxa" w:w="140"/>
+            </w:tcMar>
+            <w:vAlign w:val="center"/>
+          </w:tcPr>
+          <w:p>
+            <w:pPr>
+              <w:spacing w:after="0" w:line="264"/>
+            </w:pPr>
+            <w:r>
+              <w:rPr>
+                <w:rFonts w:ascii="Calibri" w:cs="Calibri" w:eastAsia="Calibri" w:hAnsi="Calibri"/>
+                <w:sz w:val="20"/>
+                <w:szCs w:val="20"/>
+              </w:rPr>
+              <w:t xml:space="preserve">No; cada documento se arma a mano</w:t>
+            </w:r>
+          </w:p>
+        </w:tc>
+        <w:tc>
+          <w:tcPr>
+            <w:tcW w:type="dxa" w:w="3600"/>
+            <w:tcBorders>
+              <w:top w:val="single" w:color="D9DDE1" w:sz="4"/>
+              <w:left w:val="single" w:color="D9DDE1" w:sz="4"/>
+              <w:bottom w:val="single" w:color="D9DDE1" w:sz="4"/>
+              <w:right w:val="single" w:color="D9DDE1" w:sz="4"/>
+            </w:tcBorders>
+            <w:tcMar>
+              <w:top w:type="dxa" w:w="90"/>
+              <w:left w:type="dxa" w:w="140"/>
+              <w:bottom w:type="dxa" w:w="90"/>
+              <w:right w:type="dxa" w:w="140"/>
+            </w:tcMar>
+            <w:vAlign w:val="center"/>
+          </w:tcPr>
+          <w:p>
+            <w:pPr>
+              <w:spacing w:after="0" w:line="264"/>
+            </w:pPr>
+            <w:r>
+              <w:rPr>
+                <w:rFonts w:ascii="Calibri" w:cs="Calibri" w:eastAsia="Calibri" w:hAnsi="Calibri"/>
+                <w:sz w:val="20"/>
+                <w:szCs w:val="20"/>
+              </w:rPr>
+              <w:t xml:space="preserve">Sí; precarga productos y mano de obra</w:t>
+            </w:r>
+          </w:p>
+        </w:tc>
+      </w:tr>
+      <w:tr>
+        <w:trPr>
+          <w:cantSplit/>
+        </w:trPr>
+        <w:tc>
+          <w:tcPr>
+            <w:tcW w:type="dxa" w:w="2160"/>
+            <w:tcBorders>
+              <w:top w:val="single" w:color="D9DDE1" w:sz="4"/>
+              <w:left w:val="single" w:color="D9DDE1" w:sz="4"/>
+              <w:bottom w:val="single" w:color="D9DDE1" w:sz="4"/>
+              <w:right w:val="single" w:color="D9DDE1" w:sz="4"/>
+            </w:tcBorders>
+            <w:shd w:fill="F3F4F6" w:color="auto" w:val="clear"/>
+            <w:tcMar>
+              <w:top w:type="dxa" w:w="90"/>
+              <w:left w:type="dxa" w:w="140"/>
+              <w:bottom w:type="dxa" w:w="90"/>
+              <w:right w:type="dxa" w:w="140"/>
+            </w:tcMar>
+            <w:vAlign w:val="center"/>
+          </w:tcPr>
+          <w:p>
+            <w:pPr>
+              <w:spacing w:after="0" w:line="264"/>
+            </w:pPr>
+            <w:r>
+              <w:rPr>
+                <w:rFonts w:ascii="Calibri" w:cs="Calibri" w:eastAsia="Calibri" w:hAnsi="Calibri"/>
+                <w:b/>
+                <w:bCs/>
+                <w:sz w:val="20"/>
+                <w:szCs w:val="20"/>
+              </w:rPr>
+              <w:t xml:space="preserve">Catálogo</w:t>
+            </w:r>
+          </w:p>
+        </w:tc>
+        <w:tc>
+          <w:tcPr>
+            <w:tcW w:type="dxa" w:w="3600"/>
+            <w:tcBorders>
+              <w:top w:val="single" w:color="D9DDE1" w:sz="4"/>
+              <w:left w:val="single" w:color="D9DDE1" w:sz="4"/>
+              <w:bottom w:val="single" w:color="D9DDE1" w:sz="4"/>
+              <w:right w:val="single" w:color="D9DDE1" w:sz="4"/>
+            </w:tcBorders>
+            <w:shd w:fill="F3F4F6" w:color="auto" w:val="clear"/>
+            <w:tcMar>
+              <w:top w:type="dxa" w:w="90"/>
+              <w:left w:type="dxa" w:w="140"/>
+              <w:bottom w:type="dxa" w:w="90"/>
+              <w:right w:type="dxa" w:w="140"/>
+            </w:tcMar>
+            <w:vAlign w:val="center"/>
+          </w:tcPr>
+          <w:p>
+            <w:pPr>
+              <w:spacing w:after="0" w:line="264"/>
+            </w:pPr>
+            <w:r>
+              <w:rPr>
+                <w:rFonts w:ascii="Calibri" w:cs="Calibri" w:eastAsia="Calibri" w:hAnsi="Calibri"/>
+                <w:sz w:val="20"/>
+                <w:szCs w:val="20"/>
+              </w:rPr>
+              <w:t xml:space="preserve">Se captura desde cero</w:t>
+            </w:r>
+          </w:p>
+        </w:tc>
+        <w:tc>
+          <w:tcPr>
+            <w:tcW w:type="dxa" w:w="3600"/>
+            <w:tcBorders>
+              <w:top w:val="single" w:color="D9DDE1" w:sz="4"/>
+              <w:left w:val="single" w:color="D9DDE1" w:sz="4"/>
+              <w:bottom w:val="single" w:color="D9DDE1" w:sz="4"/>
+              <w:right w:val="single" w:color="D9DDE1" w:sz="4"/>
+            </w:tcBorders>
+            <w:shd w:fill="F3F4F6" w:color="auto" w:val="clear"/>
+            <w:tcMar>
+              <w:top w:type="dxa" w:w="90"/>
+              <w:left w:type="dxa" w:w="140"/>
+              <w:bottom w:type="dxa" w:w="90"/>
+              <w:right w:type="dxa" w:w="140"/>
+            </w:tcMar>
+            <w:vAlign w:val="center"/>
+          </w:tcPr>
+          <w:p>
+            <w:pPr>
+              <w:spacing w:after="0" w:line="264"/>
+            </w:pPr>
+            <w:r>
+              <w:rPr>
+                <w:rFonts w:ascii="Calibri" w:cs="Calibri" w:eastAsia="Calibri" w:hAnsi="Calibri"/>
+                <w:sz w:val="20"/>
+                <w:szCs w:val="20"/>
+              </w:rPr>
+              <w:t xml:space="preserve">214 productos con fotos ya cargados; carga masiva por Excel</w:t>
+            </w:r>
+          </w:p>
+        </w:tc>
+      </w:tr>
+      <w:tr>
+        <w:trPr>
+          <w:cantSplit/>
+        </w:trPr>
+        <w:tc>
+          <w:tcPr>
+            <w:tcW w:type="dxa" w:w="2160"/>
+            <w:tcBorders>
+              <w:top w:val="single" w:color="D9DDE1" w:sz="4"/>
+              <w:left w:val="single" w:color="D9DDE1" w:sz="4"/>
+              <w:bottom w:val="single" w:color="D9DDE1" w:sz="4"/>
+              <w:right w:val="single" w:color="D9DDE1" w:sz="4"/>
+            </w:tcBorders>
+            <w:tcMar>
+              <w:top w:type="dxa" w:w="90"/>
+              <w:left w:type="dxa" w:w="140"/>
+              <w:bottom w:type="dxa" w:w="90"/>
+              <w:right w:type="dxa" w:w="140"/>
+            </w:tcMar>
+            <w:vAlign w:val="center"/>
+          </w:tcPr>
+          <w:p>
+            <w:pPr>
+              <w:spacing w:after="0" w:line="264"/>
+            </w:pPr>
+            <w:r>
+              <w:rPr>
+                <w:rFonts w:ascii="Calibri" w:cs="Calibri" w:eastAsia="Calibri" w:hAnsi="Calibri"/>
+                <w:b/>
+                <w:bCs/>
+                <w:sz w:val="20"/>
+                <w:szCs w:val="20"/>
+              </w:rPr>
+              <w:t xml:space="preserve">Página web</w:t>
+            </w:r>
+          </w:p>
+        </w:tc>
+        <w:tc>
+          <w:tcPr>
+            <w:tcW w:type="dxa" w:w="3600"/>
+            <w:tcBorders>
+              <w:top w:val="single" w:color="D9DDE1" w:sz="4"/>
+              <w:left w:val="single" w:color="D9DDE1" w:sz="4"/>
+              <w:bottom w:val="single" w:color="D9DDE1" w:sz="4"/>
+              <w:right w:val="single" w:color="D9DDE1" w:sz="4"/>
+            </w:tcBorders>
+            <w:tcMar>
+              <w:top w:type="dxa" w:w="90"/>
+              <w:left w:type="dxa" w:w="140"/>
+              <w:bottom w:type="dxa" w:w="90"/>
+              <w:right w:type="dxa" w:w="140"/>
+            </w:tcMar>
+            <w:vAlign w:val="center"/>
+          </w:tcPr>
+          <w:p>
+            <w:pPr>
+              <w:spacing w:after="0" w:line="264"/>
+            </w:pPr>
+            <w:r>
+              <w:rPr>
+                <w:rFonts w:ascii="Calibri" w:cs="Calibri" w:eastAsia="Calibri" w:hAnsi="Calibri"/>
+                <w:sz w:val="20"/>
+                <w:szCs w:val="20"/>
+              </w:rPr>
+              <w:t xml:space="preserve">No incluye</w:t>
+            </w:r>
+          </w:p>
+        </w:tc>
+        <w:tc>
+          <w:tcPr>
+            <w:tcW w:type="dxa" w:w="3600"/>
+            <w:tcBorders>
+              <w:top w:val="single" w:color="D9DDE1" w:sz="4"/>
+              <w:left w:val="single" w:color="D9DDE1" w:sz="4"/>
+              <w:bottom w:val="single" w:color="D9DDE1" w:sz="4"/>
+              <w:right w:val="single" w:color="D9DDE1" w:sz="4"/>
+            </w:tcBorders>
+            <w:tcMar>
+              <w:top w:type="dxa" w:w="90"/>
+              <w:left w:type="dxa" w:w="140"/>
+              <w:bottom w:type="dxa" w:w="90"/>
+              <w:right w:type="dxa" w:w="140"/>
+            </w:tcMar>
+            <w:vAlign w:val="center"/>
+          </w:tcPr>
+          <w:p>
+            <w:pPr>
+              <w:spacing w:after="0" w:line="264"/>
+            </w:pPr>
+            <w:r>
+              <w:rPr>
+                <w:rFonts w:ascii="Calibri" w:cs="Calibri" w:eastAsia="Calibri" w:hAnsi="Calibri"/>
+                <w:sz w:val="20"/>
+                <w:szCs w:val="20"/>
+              </w:rPr>
+              <w:t xml:space="preserve">Incluida y conectada al catálogo</w:t>
+            </w:r>
+          </w:p>
+        </w:tc>
+      </w:tr>
+      <w:tr>
+        <w:trPr>
+          <w:cantSplit/>
+        </w:trPr>
+        <w:tc>
+          <w:tcPr>
+            <w:tcW w:type="dxa" w:w="2160"/>
+            <w:tcBorders>
+              <w:top w:val="single" w:color="D9DDE1" w:sz="4"/>
+              <w:left w:val="single" w:color="D9DDE1" w:sz="4"/>
+              <w:bottom w:val="single" w:color="D9DDE1" w:sz="4"/>
+              <w:right w:val="single" w:color="D9DDE1" w:sz="4"/>
+            </w:tcBorders>
+            <w:shd w:fill="F3F4F6" w:color="auto" w:val="clear"/>
+            <w:tcMar>
+              <w:top w:type="dxa" w:w="90"/>
+              <w:left w:type="dxa" w:w="140"/>
+              <w:bottom w:type="dxa" w:w="90"/>
+              <w:right w:type="dxa" w:w="140"/>
+            </w:tcMar>
+            <w:vAlign w:val="center"/>
+          </w:tcPr>
+          <w:p>
+            <w:pPr>
+              <w:spacing w:after="0" w:line="264"/>
+            </w:pPr>
+            <w:r>
+              <w:rPr>
+                <w:rFonts w:ascii="Calibri" w:cs="Calibri" w:eastAsia="Calibri" w:hAnsi="Calibri"/>
+                <w:b/>
+                <w:bCs/>
+                <w:sz w:val="20"/>
+                <w:szCs w:val="20"/>
+              </w:rPr>
+              <w:t xml:space="preserve">Cobro con tarjeta</w:t>
+            </w:r>
+          </w:p>
+        </w:tc>
+        <w:tc>
+          <w:tcPr>
+            <w:tcW w:type="dxa" w:w="3600"/>
+            <w:tcBorders>
+              <w:top w:val="single" w:color="D9DDE1" w:sz="4"/>
+              <w:left w:val="single" w:color="D9DDE1" w:sz="4"/>
+              <w:bottom w:val="single" w:color="D9DDE1" w:sz="4"/>
+              <w:right w:val="single" w:color="D9DDE1" w:sz="4"/>
+            </w:tcBorders>
+            <w:shd w:fill="F3F4F6" w:color="auto" w:val="clear"/>
+            <w:tcMar>
+              <w:top w:type="dxa" w:w="90"/>
+              <w:left w:type="dxa" w:w="140"/>
+              <w:bottom w:type="dxa" w:w="90"/>
+              <w:right w:type="dxa" w:w="140"/>
+            </w:tcMar>
+            <w:vAlign w:val="center"/>
+          </w:tcPr>
+          <w:p>
+            <w:pPr>
+              <w:spacing w:after="0" w:line="264"/>
+            </w:pPr>
+            <w:r>
+              <w:rPr>
+                <w:rFonts w:ascii="Calibri" w:cs="Calibri" w:eastAsia="Calibri" w:hAnsi="Calibri"/>
+                <w:sz w:val="20"/>
+                <w:szCs w:val="20"/>
+              </w:rPr>
+              <w:t xml:space="preserve">Sí</w:t>
+            </w:r>
+          </w:p>
+        </w:tc>
+        <w:tc>
+          <w:tcPr>
+            <w:tcW w:type="dxa" w:w="3600"/>
+            <w:tcBorders>
+              <w:top w:val="single" w:color="D9DDE1" w:sz="4"/>
+              <w:left w:val="single" w:color="D9DDE1" w:sz="4"/>
+              <w:bottom w:val="single" w:color="D9DDE1" w:sz="4"/>
+              <w:right w:val="single" w:color="D9DDE1" w:sz="4"/>
+            </w:tcBorders>
+            <w:shd w:fill="F3F4F6" w:color="auto" w:val="clear"/>
+            <w:tcMar>
+              <w:top w:type="dxa" w:w="90"/>
+              <w:left w:type="dxa" w:w="140"/>
+              <w:bottom w:type="dxa" w:w="90"/>
+              <w:right w:type="dxa" w:w="140"/>
+            </w:tcMar>
+            <w:vAlign w:val="center"/>
+          </w:tcPr>
+          <w:p>
+            <w:pPr>
+              <w:spacing w:after="0" w:line="264"/>
+            </w:pPr>
+            <w:r>
+              <w:rPr>
+                <w:rFonts w:ascii="Calibri" w:cs="Calibri" w:eastAsia="Calibri" w:hAnsi="Calibri"/>
+                <w:sz w:val="20"/>
+                <w:szCs w:val="20"/>
+              </w:rPr>
+              <w:t xml:space="preserve">No por ahora (se puede agregar)</w:t>
+            </w:r>
+          </w:p>
+        </w:tc>
+      </w:tr>
+      <w:tr>
+        <w:trPr>
+          <w:cantSplit/>
+        </w:trPr>
+        <w:tc>
+          <w:tcPr>
+            <w:tcW w:type="dxa" w:w="2160"/>
+            <w:tcBorders>
+              <w:top w:val="single" w:color="D9DDE1" w:sz="4"/>
+              <w:left w:val="single" w:color="D9DDE1" w:sz="4"/>
+              <w:bottom w:val="single" w:color="D9DDE1" w:sz="4"/>
+              <w:right w:val="single" w:color="D9DDE1" w:sz="4"/>
+            </w:tcBorders>
+            <w:tcMar>
+              <w:top w:type="dxa" w:w="90"/>
+              <w:left w:type="dxa" w:w="140"/>
+              <w:bottom w:type="dxa" w:w="90"/>
+              <w:right w:type="dxa" w:w="140"/>
+            </w:tcMar>
+            <w:vAlign w:val="center"/>
+          </w:tcPr>
+          <w:p>
+            <w:pPr>
+              <w:spacing w:after="0" w:line="264"/>
+            </w:pPr>
+            <w:r>
+              <w:rPr>
+                <w:rFonts w:ascii="Calibri" w:cs="Calibri" w:eastAsia="Calibri" w:hAnsi="Calibri"/>
+                <w:b/>
+                <w:bCs/>
+                <w:sz w:val="20"/>
+                <w:szCs w:val="20"/>
+              </w:rPr>
+              <w:t xml:space="preserve">Soporte</w:t>
+            </w:r>
+          </w:p>
+        </w:tc>
+        <w:tc>
+          <w:tcPr>
+            <w:tcW w:type="dxa" w:w="3600"/>
+            <w:tcBorders>
+              <w:top w:val="single" w:color="D9DDE1" w:sz="4"/>
+              <w:left w:val="single" w:color="D9DDE1" w:sz="4"/>
+              <w:bottom w:val="single" w:color="D9DDE1" w:sz="4"/>
+              <w:right w:val="single" w:color="D9DDE1" w:sz="4"/>
+            </w:tcBorders>
+            <w:tcMar>
+              <w:top w:type="dxa" w:w="90"/>
+              <w:left w:type="dxa" w:w="140"/>
+              <w:bottom w:type="dxa" w:w="90"/>
+              <w:right w:type="dxa" w:w="140"/>
+            </w:tcMar>
+            <w:vAlign w:val="center"/>
+          </w:tcPr>
+          <w:p>
+            <w:pPr>
+              <w:spacing w:after="0" w:line="264"/>
+            </w:pPr>
+            <w:r>
+              <w:rPr>
+                <w:rFonts w:ascii="Calibri" w:cs="Calibri" w:eastAsia="Calibri" w:hAnsi="Calibri"/>
+                <w:sz w:val="20"/>
+                <w:szCs w:val="20"/>
+              </w:rPr>
+              <w:t xml:space="preserve">De la empresa, sin cambios a la medida</w:t>
+            </w:r>
+          </w:p>
+        </w:tc>
+        <w:tc>
+          <w:tcPr>
+            <w:tcW w:type="dxa" w:w="3600"/>
+            <w:tcBorders>
+              <w:top w:val="single" w:color="D9DDE1" w:sz="4"/>
+              <w:left w:val="single" w:color="D9DDE1" w:sz="4"/>
+              <w:bottom w:val="single" w:color="D9DDE1" w:sz="4"/>
+              <w:right w:val="single" w:color="D9DDE1" w:sz="4"/>
+            </w:tcBorders>
+            <w:tcMar>
+              <w:top w:type="dxa" w:w="90"/>
+              <w:left w:type="dxa" w:w="140"/>
+              <w:bottom w:type="dxa" w:w="90"/>
+              <w:right w:type="dxa" w:w="140"/>
+            </w:tcMar>
+            <w:vAlign w:val="center"/>
+          </w:tcPr>
+          <w:p>
+            <w:pPr>
+              <w:spacing w:after="0" w:line="264"/>
+            </w:pPr>
+            <w:r>
+              <w:rPr>
+                <w:rFonts w:ascii="Calibri" w:cs="Calibri" w:eastAsia="Calibri" w:hAnsi="Calibri"/>
+                <w:sz w:val="20"/>
+                <w:szCs w:val="20"/>
+              </w:rPr>
+              <w:t xml:space="preserve">Directo, en español y con cambios a la medida</w:t>
+            </w:r>
+          </w:p>
+        </w:tc>
+      </w:tr>
+      <w:tr>
+        <w:trPr>
+          <w:cantSplit/>
+        </w:trPr>
+        <w:tc>
+          <w:tcPr>
+            <w:tcW w:type="dxa" w:w="2160"/>
+            <w:tcBorders>
+              <w:top w:val="single" w:color="D9DDE1" w:sz="4"/>
+              <w:left w:val="single" w:color="D9DDE1" w:sz="4"/>
+              <w:bottom w:val="single" w:color="D9DDE1" w:sz="4"/>
+              <w:right w:val="single" w:color="D9DDE1" w:sz="4"/>
+            </w:tcBorders>
+            <w:shd w:fill="F3F4F6" w:color="auto" w:val="clear"/>
+            <w:tcMar>
+              <w:top w:type="dxa" w:w="90"/>
+              <w:left w:type="dxa" w:w="140"/>
+              <w:bottom w:type="dxa" w:w="90"/>
+              <w:right w:type="dxa" w:w="140"/>
+            </w:tcMar>
+            <w:vAlign w:val="center"/>
+          </w:tcPr>
+          <w:p>
+            <w:pPr>
+              <w:spacing w:after="0" w:line="264"/>
+            </w:pPr>
+            <w:r>
+              <w:rPr>
+                <w:rFonts w:ascii="Calibri" w:cs="Calibri" w:eastAsia="Calibri" w:hAnsi="Calibri"/>
+                <w:b/>
+                <w:bCs/>
+                <w:sz w:val="20"/>
+                <w:szCs w:val="20"/>
+              </w:rPr>
+              <w:t xml:space="preserve">Tus datos</w:t>
+            </w:r>
+          </w:p>
+        </w:tc>
+        <w:tc>
+          <w:tcPr>
+            <w:tcW w:type="dxa" w:w="3600"/>
+            <w:tcBorders>
+              <w:top w:val="single" w:color="D9DDE1" w:sz="4"/>
+              <w:left w:val="single" w:color="D9DDE1" w:sz="4"/>
+              <w:bottom w:val="single" w:color="D9DDE1" w:sz="4"/>
+              <w:right w:val="single" w:color="D9DDE1" w:sz="4"/>
+            </w:tcBorders>
+            <w:shd w:fill="F3F4F6" w:color="auto" w:val="clear"/>
+            <w:tcMar>
+              <w:top w:type="dxa" w:w="90"/>
+              <w:left w:type="dxa" w:w="140"/>
+              <w:bottom w:type="dxa" w:w="90"/>
+              <w:right w:type="dxa" w:w="140"/>
+            </w:tcMar>
+            <w:vAlign w:val="center"/>
+          </w:tcPr>
+          <w:p>
+            <w:pPr>
+              <w:spacing w:after="0" w:line="264"/>
+            </w:pPr>
+            <w:r>
+              <w:rPr>
+                <w:rFonts w:ascii="Calibri" w:cs="Calibri" w:eastAsia="Calibri" w:hAnsi="Calibri"/>
+                <w:sz w:val="20"/>
+                <w:szCs w:val="20"/>
+              </w:rPr>
+              <w:t xml:space="preserve">En la app; si dejas de pagar pierdes el acceso</w:t>
+            </w:r>
+          </w:p>
+        </w:tc>
+        <w:tc>
+          <w:tcPr>
+            <w:tcW w:type="dxa" w:w="3600"/>
+            <w:tcBorders>
+              <w:top w:val="single" w:color="D9DDE1" w:sz="4"/>
+              <w:left w:val="single" w:color="D9DDE1" w:sz="4"/>
+              <w:bottom w:val="single" w:color="D9DDE1" w:sz="4"/>
+              <w:right w:val="single" w:color="D9DDE1" w:sz="4"/>
+            </w:tcBorders>
+            <w:shd w:fill="F3F4F6" w:color="auto" w:val="clear"/>
+            <w:tcMar>
+              <w:top w:type="dxa" w:w="90"/>
+              <w:left w:type="dxa" w:w="140"/>
+              <w:bottom w:type="dxa" w:w="90"/>
+              <w:right w:type="dxa" w:w="140"/>
+            </w:tcMar>
+            <w:vAlign w:val="center"/>
+          </w:tcPr>
+          <w:p>
+            <w:pPr>
+              <w:spacing w:after="0" w:line="264"/>
+            </w:pPr>
+            <w:r>
+              <w:rPr>
+                <w:rFonts w:ascii="Calibri" w:cs="Calibri" w:eastAsia="Calibri" w:hAnsi="Calibri"/>
+                <w:sz w:val="20"/>
+                <w:szCs w:val="20"/>
+              </w:rPr>
+              <w:t xml:space="preserve">Exportables a Excel cuando quieras</w:t>
+            </w:r>
+          </w:p>
+        </w:tc>
+      </w:tr>
+      <w:tr>
+        <w:trPr>
+          <w:cantSplit/>
+        </w:trPr>
+        <w:tc>
+          <w:tcPr>
+            <w:tcW w:type="dxa" w:w="2160"/>
+            <w:tcBorders>
+              <w:top w:val="single" w:color="D9DDE1" w:sz="4"/>
+              <w:left w:val="single" w:color="D9DDE1" w:sz="4"/>
+              <w:bottom w:val="single" w:color="D9DDE1" w:sz="4"/>
+              <w:right w:val="single" w:color="D9DDE1" w:sz="4"/>
+            </w:tcBorders>
+            <w:tcMar>
+              <w:top w:type="dxa" w:w="90"/>
+              <w:left w:type="dxa" w:w="140"/>
+              <w:bottom w:type="dxa" w:w="90"/>
+              <w:right w:type="dxa" w:w="140"/>
+            </w:tcMar>
+            <w:vAlign w:val="center"/>
+          </w:tcPr>
+          <w:p>
+            <w:pPr>
+              <w:spacing w:after="0" w:line="264"/>
+            </w:pPr>
+            <w:r>
+              <w:rPr>
+                <w:rFonts w:ascii="Calibri" w:cs="Calibri" w:eastAsia="Calibri" w:hAnsi="Calibri"/>
+                <w:b/>
+                <w:bCs/>
+                <w:sz w:val="20"/>
+                <w:szCs w:val="20"/>
+              </w:rPr>
+              <w:t xml:space="preserve">Precio a futuro</w:t>
+            </w:r>
+          </w:p>
+        </w:tc>
+        <w:tc>
+          <w:tcPr>
+            <w:tcW w:type="dxa" w:w="3600"/>
+            <w:tcBorders>
+              <w:top w:val="single" w:color="D9DDE1" w:sz="4"/>
+              <w:left w:val="single" w:color="D9DDE1" w:sz="4"/>
+              <w:bottom w:val="single" w:color="D9DDE1" w:sz="4"/>
+              <w:right w:val="single" w:color="D9DDE1" w:sz="4"/>
+            </w:tcBorders>
+            <w:tcMar>
+              <w:top w:type="dxa" w:w="90"/>
+              <w:left w:type="dxa" w:w="140"/>
+              <w:bottom w:type="dxa" w:w="90"/>
+              <w:right w:type="dxa" w:w="140"/>
+            </w:tcMar>
+            <w:vAlign w:val="center"/>
+          </w:tcPr>
+          <w:p>
+            <w:pPr>
+              <w:spacing w:after="0" w:line="264"/>
+            </w:pPr>
+            <w:r>
+              <w:rPr>
+                <w:rFonts w:ascii="Calibri" w:cs="Calibri" w:eastAsia="Calibri" w:hAnsi="Calibri"/>
+                <w:sz w:val="20"/>
+                <w:szCs w:val="20"/>
+              </w:rPr>
+              <w:t xml:space="preserve">Lo decide la empresa de la app</w:t>
+            </w:r>
+          </w:p>
+        </w:tc>
+        <w:tc>
+          <w:tcPr>
+            <w:tcW w:type="dxa" w:w="3600"/>
+            <w:tcBorders>
+              <w:top w:val="single" w:color="D9DDE1" w:sz="4"/>
+              <w:left w:val="single" w:color="D9DDE1" w:sz="4"/>
+              <w:bottom w:val="single" w:color="D9DDE1" w:sz="4"/>
+              <w:right w:val="single" w:color="D9DDE1" w:sz="4"/>
+            </w:tcBorders>
+            <w:tcMar>
+              <w:top w:type="dxa" w:w="90"/>
+              <w:left w:type="dxa" w:w="140"/>
+              <w:bottom w:type="dxa" w:w="90"/>
+              <w:right w:type="dxa" w:w="140"/>
+            </w:tcMar>
+            <w:vAlign w:val="center"/>
+          </w:tcPr>
+          <w:p>
+            <w:pPr>
+              <w:spacing w:after="0" w:line="264"/>
+            </w:pPr>
+            <w:r>
+              <w:rPr>
+                <w:rFonts w:ascii="Calibri" w:cs="Calibri" w:eastAsia="Calibri" w:hAnsi="Calibri"/>
+                <w:sz w:val="20"/>
+                <w:szCs w:val="20"/>
+              </w:rPr>
+              <w:t xml:space="preserve">Fijo según lo acordado</w:t>
+            </w:r>
+          </w:p>
+        </w:tc>
+      </w:tr>
+    </w:tbl>
+    <w:p>
+      <w:pPr>
+        <w:keepNext/>
+        <w:spacing w:after="80" w:before="160" w:line="276"/>
+      </w:pPr>
+      <w:r>
+        <w:rPr>
+          <w:rFonts w:ascii="Calibri" w:cs="Calibri" w:eastAsia="Calibri" w:hAnsi="Calibri"/>
+          <w:b/>
+          <w:bCs/>
+          <w:color w:val="1F2A22"/>
+          <w:sz w:val="22"/>
+          <w:szCs w:val="22"/>
+        </w:rPr>
+        <w:t xml:space="preserve">Ventajas del sistema a la medida</w:t>
+      </w:r>
+    </w:p>
+    <w:p>
+      <w:pPr>
+        <w:pStyle w:val="ListParagraph"/>
+        <w:numPr>
+          <w:ilvl w:val="0"/>
+          <w:numId w:val="2"/>
+        </w:numPr>
+        <w:spacing w:after="60" w:before="0" w:line="276"/>
+      </w:pPr>
+      <w:r>
+        <w:rPr>
+          <w:rFonts w:ascii="Calibri" w:cs="Calibri" w:eastAsia="Calibri" w:hAnsi="Calibri"/>
+          <w:sz w:val="21"/>
+          <w:szCs w:val="21"/>
+        </w:rPr>
+        <w:t xml:space="preserve">Hecho para cómo cotiza ImpleGas: bases por servicio, mano de obra, área, incluye, garantía y nota.</w:t>
+      </w:r>
+    </w:p>
+    <w:p>
+      <w:pPr>
+        <w:pStyle w:val="ListParagraph"/>
+        <w:numPr>
+          <w:ilvl w:val="0"/>
+          <w:numId w:val="2"/>
+        </w:numPr>
+        <w:spacing w:after="60" w:before="0" w:line="276"/>
+      </w:pPr>
+      <w:r>
+        <w:rPr>
+          <w:rFonts w:ascii="Calibri" w:cs="Calibri" w:eastAsia="Calibri" w:hAnsi="Calibri"/>
+          <w:sz w:val="21"/>
+          <w:szCs w:val="21"/>
+        </w:rPr>
+        <w:t xml:space="preserve">El PDF sale igual al que tus clientes ya conocen.</w:t>
+      </w:r>
+    </w:p>
+    <w:p>
+      <w:pPr>
+        <w:pStyle w:val="ListParagraph"/>
+        <w:numPr>
+          <w:ilvl w:val="0"/>
+          <w:numId w:val="2"/>
+        </w:numPr>
+        <w:spacing w:after="60" w:before="0" w:line="276"/>
+      </w:pPr>
+      <w:r>
+        <w:rPr>
+          <w:rFonts w:ascii="Calibri" w:cs="Calibri" w:eastAsia="Calibri" w:hAnsi="Calibri"/>
+          <w:sz w:val="21"/>
+          <w:szCs w:val="21"/>
+        </w:rPr>
+        <w:t xml:space="preserve">Incluye la página web, conectada al mismo catálogo y con contacto directo por WhatsApp.</w:t>
+      </w:r>
+    </w:p>
+    <w:p>
+      <w:pPr>
+        <w:pStyle w:val="ListParagraph"/>
+        <w:numPr>
+          <w:ilvl w:val="0"/>
+          <w:numId w:val="2"/>
+        </w:numPr>
+        <w:spacing w:after="60" w:before="0" w:line="276"/>
+      </w:pPr>
+      <w:r>
+        <w:rPr>
+          <w:rFonts w:ascii="Calibri" w:cs="Calibri" w:eastAsia="Calibri" w:hAnsi="Calibri"/>
+          <w:sz w:val="21"/>
+          <w:szCs w:val="21"/>
+        </w:rPr>
+        <w:t xml:space="preserve">Soporte directo con quien lo hizo: un cambio se pide por WhatsApp y se hace en días.</w:t>
+      </w:r>
+    </w:p>
+    <w:p>
+      <w:pPr>
+        <w:pStyle w:val="ListParagraph"/>
+        <w:numPr>
+          <w:ilvl w:val="0"/>
+          <w:numId w:val="2"/>
+        </w:numPr>
+        <w:spacing w:after="60" w:before="0" w:line="276"/>
+      </w:pPr>
+      <w:r>
+        <w:rPr>
+          <w:rFonts w:ascii="Calibri" w:cs="Calibri" w:eastAsia="Calibri" w:hAnsi="Calibri"/>
+          <w:sz w:val="21"/>
+          <w:szCs w:val="21"/>
+        </w:rPr>
+        <w:t xml:space="preserve">Crece contigo: seguimiento de cotizaciones, inventario, cobro en línea, facturación CFDI o reportes de ventas.</w:t>
+      </w:r>
+    </w:p>
+    <w:p>
+      <w:pPr>
+        <w:keepNext/>
+        <w:spacing w:after="80" w:before="160" w:line="276"/>
+      </w:pPr>
+      <w:r>
+        <w:rPr>
+          <w:rFonts w:ascii="Calibri" w:cs="Calibri" w:eastAsia="Calibri" w:hAnsi="Calibri"/>
+          <w:b/>
+          <w:bCs/>
+          <w:color w:val="1F2A22"/>
+          <w:sz w:val="22"/>
+          <w:szCs w:val="22"/>
+        </w:rPr>
+        <w:t xml:space="preserve">Lo que hay que considerar</w:t>
+      </w:r>
+    </w:p>
+    <w:p>
+      <w:pPr>
+        <w:pStyle w:val="ListParagraph"/>
+        <w:numPr>
+          <w:ilvl w:val="0"/>
+          <w:numId w:val="2"/>
+        </w:numPr>
+        <w:spacing w:after="60" w:before="0" w:line="276"/>
+      </w:pPr>
+      <w:r>
+        <w:rPr>
+          <w:rFonts w:ascii="Calibri" w:cs="Calibri" w:eastAsia="Calibri" w:hAnsi="Calibri"/>
+          <w:sz w:val="21"/>
+          <w:szCs w:val="21"/>
+        </w:rPr>
+        <w:t xml:space="preserve">Cuesta más que una suscripción genérica.</w:t>
+      </w:r>
+    </w:p>
+    <w:p>
+      <w:pPr>
+        <w:pStyle w:val="ListParagraph"/>
+        <w:numPr>
+          <w:ilvl w:val="0"/>
+          <w:numId w:val="2"/>
+        </w:numPr>
+        <w:spacing w:after="60" w:before="0" w:line="276"/>
+      </w:pPr>
+      <w:r>
+        <w:rPr>
+          <w:rFonts w:ascii="Calibri" w:cs="Calibri" w:eastAsia="Calibri" w:hAnsi="Calibri"/>
+          <w:sz w:val="21"/>
+          <w:szCs w:val="21"/>
+        </w:rPr>
+        <w:t xml:space="preserve">Hoy no cobra con tarjeta ni emite factura fiscal (CFDI); se puede agregar después con costo.</w:t>
+      </w:r>
+    </w:p>
+    <w:p>
+      <w:pPr>
+        <w:pStyle w:val="ListParagraph"/>
+        <w:numPr>
+          <w:ilvl w:val="0"/>
+          <w:numId w:val="2"/>
+        </w:numPr>
+        <w:spacing w:after="60" w:before="0" w:line="276"/>
+      </w:pPr>
+      <w:r>
+        <w:rPr>
+          <w:rFonts w:ascii="Calibri" w:cs="Calibri" w:eastAsia="Calibri" w:hAnsi="Calibri"/>
+          <w:sz w:val="21"/>
+          <w:szCs w:val="21"/>
+        </w:rPr>
+        <w:t xml:space="preserve">La app genérica no incluye página web: tendrías que pagar una aparte ($8,000 a $15,000 en el mercado) y mantener el catálogo en dos lugares.</w:t>
+      </w:r>
+    </w:p>
+    <w:p>
+      <w:pPr>
+        <w:spacing w:after="120" w:before="160" w:line="276"/>
+      </w:pPr>
+      <w:r>
+        <w:rPr>
+          <w:rFonts w:ascii="Calibri" w:cs="Calibri" w:eastAsia="Calibri" w:hAnsi="Calibri"/>
+          <w:b/>
+          <w:bCs/>
+          <w:color w:val="2F9A3F"/>
+          <w:sz w:val="21"/>
+          <w:szCs w:val="21"/>
+        </w:rPr>
+        <w:t xml:space="preserve">Recomendación: </w:t>
+      </w:r>
+      <w:r>
+        <w:rPr>
+          <w:rFonts w:ascii="Calibri" w:cs="Calibri" w:eastAsia="Calibri" w:hAnsi="Calibri"/>
+          <w:sz w:val="21"/>
+          <w:szCs w:val="21"/>
+        </w:rPr>
+        <w:t xml:space="preserve">si solo buscas hacer documentos rápido y cobrar con tarjeta, la app es suficiente. Si quieres cotizar como ImpleGas ya lo hace, con tu formato, tu catálogo, tu página web y alguien que ajuste el sistema cuando lo necesites, el sistema a la medida es la mejor inversión. La Opción B permite empezar sin pago inicial.</w:t>
       </w:r>
     </w:p>
     <w:p>

</xml_diff>

<commit_message>
Cotización con la imagen de Desoftech
Co-Authored-By: Claude Opus 5.5 (1M context) <noreply@anthropic.com>
</commit_message>
<xml_diff>
--- a/cotizacionSistema v1/Cotizacion-sistema-ImpleGas-v1.docx
+++ b/cotizacionSistema v1/Cotizacion-sistema-ImpleGas-v1.docx
@@ -29,59 +29,13 @@
               <w:bottom w:val="none" w:color="FFFFFF" w:sz="0"/>
               <w:right w:val="none" w:color="FFFFFF" w:sz="0"/>
             </w:tcBorders>
-          </w:tcPr>
-          <w:p>
-            <w:pPr>
-              <w:spacing w:after="40"/>
-            </w:pPr>
-            <w:r>
-              <w:rPr>
-                <w:rFonts w:ascii="Calibri" w:cs="Calibri" w:eastAsia="Calibri" w:hAnsi="Calibri"/>
-                <w:b/>
-                <w:bCs/>
-                <w:color w:val="1F2A22"/>
-                <w:sz w:val="44"/>
-                <w:szCs w:val="44"/>
-              </w:rPr>
-              <w:t xml:space="preserve">COTIZACIÓN</w:t>
-            </w:r>
-          </w:p>
-          <w:p>
-            <w:pPr>
-              <w:spacing w:after="0"/>
-            </w:pPr>
-            <w:r>
-              <w:rPr>
-                <w:rFonts w:ascii="Calibri" w:cs="Calibri" w:eastAsia="Calibri" w:hAnsi="Calibri"/>
-                <w:b/>
-                <w:bCs/>
-                <w:color w:val="2F9A3F"/>
-                <w:sz w:val="24"/>
-                <w:szCs w:val="24"/>
-              </w:rPr>
-              <w:t xml:space="preserve">Página web y sistema de cotizaciones</w:t>
-            </w:r>
-          </w:p>
-        </w:tc>
-        <w:tc>
-          <w:tcPr>
-            <w:tcW w:type="dxa" w:w="3960"/>
-            <w:tcBorders>
-              <w:top w:val="none" w:color="FFFFFF" w:sz="0"/>
-              <w:left w:val="none" w:color="FFFFFF" w:sz="0"/>
-              <w:bottom w:val="none" w:color="FFFFFF" w:sz="0"/>
-              <w:right w:val="none" w:color="FFFFFF" w:sz="0"/>
-            </w:tcBorders>
-            <w:vAlign w:val="center"/>
-          </w:tcPr>
-          <w:p>
-            <w:pPr>
-              <w:jc w:val="right"/>
-            </w:pPr>
+            <w:vAlign w:val="center"/>
+          </w:tcPr>
+          <w:p>
             <w:r>
               <w:drawing>
                 <wp:inline distT="0" distB="0" distL="0" distR="0">
-                  <wp:extent cx="1809750" cy="542925"/>
+                  <wp:extent cx="2286000" cy="523875"/>
                   <wp:effectExtent t="0" r="0" b="0" l="0"/>
                   <wp:docPr id="1" name="" descr="" title=""/>
                   <wp:cNvGraphicFramePr>
@@ -106,7 +60,7 @@
                         <pic:spPr bwMode="auto">
                           <a:xfrm>
                             <a:off x="0" y="0"/>
-                            <a:ext cx="1809750" cy="542925"/>
+                            <a:ext cx="2286000" cy="523875"/>
                           </a:xfrm>
                           <a:prstGeom prst="rect">
                             <a:avLst/>
@@ -120,12 +74,116 @@
             </w:r>
           </w:p>
         </w:tc>
+        <w:tc>
+          <w:tcPr>
+            <w:tcW w:type="dxa" w:w="3960"/>
+            <w:tcBorders>
+              <w:top w:val="none" w:color="FFFFFF" w:sz="0"/>
+              <w:left w:val="none" w:color="FFFFFF" w:sz="0"/>
+              <w:bottom w:val="none" w:color="FFFFFF" w:sz="0"/>
+              <w:right w:val="none" w:color="FFFFFF" w:sz="0"/>
+            </w:tcBorders>
+            <w:vAlign w:val="center"/>
+          </w:tcPr>
+          <w:p>
+            <w:pPr>
+              <w:spacing w:after="20"/>
+              <w:jc w:val="right"/>
+            </w:pPr>
+            <w:r>
+              <w:rPr>
+                <w:rFonts w:ascii="Calibri" w:cs="Calibri" w:eastAsia="Calibri" w:hAnsi="Calibri"/>
+                <w:color w:val="5B6472"/>
+                <w:sz w:val="16"/>
+                <w:szCs w:val="16"/>
+              </w:rPr>
+              <w:t xml:space="preserve">Propuesta para</w:t>
+            </w:r>
+          </w:p>
+          <w:p>
+            <w:pPr>
+              <w:jc w:val="right"/>
+            </w:pPr>
+            <w:r>
+              <w:drawing>
+                <wp:inline distT="0" distB="0" distL="0" distR="0">
+                  <wp:extent cx="1524000" cy="457200"/>
+                  <wp:effectExtent t="0" r="0" b="0" l="0"/>
+                  <wp:docPr id="1" name="" descr="" title=""/>
+                  <wp:cNvGraphicFramePr>
+                    <a:graphicFrameLocks xmlns:a="http://schemas.openxmlformats.org/drawingml/2006/main" noChangeAspect="1"/>
+                  </wp:cNvGraphicFramePr>
+                  <a:graphic xmlns:a="http://schemas.openxmlformats.org/drawingml/2006/main">
+                    <a:graphicData uri="http://schemas.openxmlformats.org/drawingml/2006/picture">
+                      <pic:pic xmlns:pic="http://schemas.openxmlformats.org/drawingml/2006/picture">
+                        <pic:nvPicPr>
+                          <pic:cNvPr id="0" name="" descr=""/>
+                          <pic:cNvPicPr>
+                            <a:picLocks noChangeAspect="1" noChangeArrowheads="1"/>
+                          </pic:cNvPicPr>
+                        </pic:nvPicPr>
+                        <pic:blipFill>
+                          <a:blip r:embed="rId9" cstate="none"/>
+                          <a:srcRect/>
+                          <a:stretch>
+                            <a:fillRect/>
+                          </a:stretch>
+                        </pic:blipFill>
+                        <pic:spPr bwMode="auto">
+                          <a:xfrm>
+                            <a:off x="0" y="0"/>
+                            <a:ext cx="1524000" cy="457200"/>
+                          </a:xfrm>
+                          <a:prstGeom prst="rect">
+                            <a:avLst/>
+                          </a:prstGeom>
+                        </pic:spPr>
+                      </pic:pic>
+                    </a:graphicData>
+                  </a:graphic>
+                </wp:inline>
+              </w:drawing>
+            </w:r>
+          </w:p>
+        </w:tc>
       </w:tr>
     </w:tbl>
     <w:p>
       <w:pPr>
+        <w:spacing w:before="240" w:after="40"/>
+      </w:pPr>
+      <w:r>
+        <w:rPr>
+          <w:rFonts w:ascii="Calibri" w:cs="Calibri" w:eastAsia="Calibri" w:hAnsi="Calibri"/>
+          <w:b/>
+          <w:bCs/>
+          <w:color w:val="14294B"/>
+          <w:sz w:val="44"/>
+          <w:szCs w:val="44"/>
+        </w:rPr>
+        <w:t xml:space="preserve">COTIZACIÓN</w:t>
+      </w:r>
+    </w:p>
+    <w:p>
+      <w:pPr>
+        <w:spacing w:after="0"/>
+      </w:pPr>
+      <w:r>
+        <w:rPr>
+          <w:rFonts w:ascii="Calibri" w:cs="Calibri" w:eastAsia="Calibri" w:hAnsi="Calibri"/>
+          <w:b/>
+          <w:bCs/>
+          <w:color w:val="5B6472"/>
+          <w:sz w:val="24"/>
+          <w:szCs w:val="24"/>
+        </w:rPr>
+        <w:t xml:space="preserve">Página web y sistema de cotizaciones</w:t>
+      </w:r>
+    </w:p>
+    <w:p>
+      <w:pPr>
         <w:pBdr>
-          <w:bottom w:val="single" w:color="2F9A3F" w:sz="18" w:space="1"/>
+          <w:bottom w:val="single" w:color="F2C914" w:sz="18" w:space="1"/>
         </w:pBdr>
         <w:spacing w:after="160"/>
       </w:pPr>
@@ -180,7 +238,7 @@
                 <w:rFonts w:ascii="Calibri" w:cs="Calibri" w:eastAsia="Calibri" w:hAnsi="Calibri"/>
                 <w:b/>
                 <w:bCs/>
-                <w:color w:val="5F6368"/>
+                <w:color w:val="5B6472"/>
                 <w:sz w:val="20"/>
                 <w:szCs w:val="20"/>
               </w:rPr>
@@ -248,7 +306,7 @@
                 <w:rFonts w:ascii="Calibri" w:cs="Calibri" w:eastAsia="Calibri" w:hAnsi="Calibri"/>
                 <w:b/>
                 <w:bCs/>
-                <w:color w:val="5F6368"/>
+                <w:color w:val="5B6472"/>
                 <w:sz w:val="20"/>
                 <w:szCs w:val="20"/>
               </w:rPr>
@@ -321,7 +379,7 @@
                 <w:rFonts w:ascii="Calibri" w:cs="Calibri" w:eastAsia="Calibri" w:hAnsi="Calibri"/>
                 <w:b/>
                 <w:bCs/>
-                <w:color w:val="5F6368"/>
+                <w:color w:val="5B6472"/>
                 <w:sz w:val="20"/>
                 <w:szCs w:val="20"/>
               </w:rPr>
@@ -389,7 +447,7 @@
                 <w:rFonts w:ascii="Calibri" w:cs="Calibri" w:eastAsia="Calibri" w:hAnsi="Calibri"/>
                 <w:b/>
                 <w:bCs/>
-                <w:color w:val="5F6368"/>
+                <w:color w:val="5B6472"/>
                 <w:sz w:val="20"/>
                 <w:szCs w:val="20"/>
               </w:rPr>
@@ -462,7 +520,7 @@
                 <w:rFonts w:ascii="Calibri" w:cs="Calibri" w:eastAsia="Calibri" w:hAnsi="Calibri"/>
                 <w:b/>
                 <w:bCs/>
-                <w:color w:val="5F6368"/>
+                <w:color w:val="5B6472"/>
                 <w:sz w:val="20"/>
                 <w:szCs w:val="20"/>
               </w:rPr>
@@ -530,7 +588,7 @@
                 <w:rFonts w:ascii="Calibri" w:cs="Calibri" w:eastAsia="Calibri" w:hAnsi="Calibri"/>
                 <w:b/>
                 <w:bCs/>
-                <w:color w:val="5F6368"/>
+                <w:color w:val="5B6472"/>
                 <w:sz w:val="20"/>
                 <w:szCs w:val="20"/>
               </w:rPr>
@@ -603,7 +661,7 @@
                 <w:rFonts w:ascii="Calibri" w:cs="Calibri" w:eastAsia="Calibri" w:hAnsi="Calibri"/>
                 <w:b/>
                 <w:bCs/>
-                <w:color w:val="5F6368"/>
+                <w:color w:val="5B6472"/>
                 <w:sz w:val="20"/>
                 <w:szCs w:val="20"/>
               </w:rPr>
@@ -640,7 +698,7 @@
                 <w:sz w:val="20"/>
                 <w:szCs w:val="20"/>
               </w:rPr>
-              <w:t xml:space="preserve">Ramiro Tello</w:t>
+              <w:t xml:space="preserve">Ramiro Tello · Desoftech</w:t>
             </w:r>
           </w:p>
         </w:tc>
@@ -671,7 +729,7 @@
                 <w:rFonts w:ascii="Calibri" w:cs="Calibri" w:eastAsia="Calibri" w:hAnsi="Calibri"/>
                 <w:b/>
                 <w:bCs/>
-                <w:color w:val="5F6368"/>
+                <w:color w:val="5B6472"/>
                 <w:sz w:val="20"/>
                 <w:szCs w:val="20"/>
               </w:rPr>
@@ -718,7 +776,7 @@
       <w:pPr>
         <w:keepNext/>
         <w:pBdr>
-          <w:bottom w:val="single" w:color="2F9A3F" w:sz="8" w:space="4"/>
+          <w:bottom w:val="single" w:color="14294B" w:sz="8" w:space="4"/>
         </w:pBdr>
         <w:spacing w:before="320" w:after="140"/>
       </w:pPr>
@@ -727,7 +785,7 @@
           <w:rFonts w:ascii="Calibri" w:cs="Calibri" w:eastAsia="Calibri" w:hAnsi="Calibri"/>
           <w:b/>
           <w:bCs/>
-          <w:color w:val="2F9A3F"/>
+          <w:color w:val="14294B"/>
           <w:sz w:val="24"/>
           <w:szCs w:val="24"/>
         </w:rPr>
@@ -843,7 +901,7 @@
       <w:pPr>
         <w:keepNext/>
         <w:pBdr>
-          <w:bottom w:val="single" w:color="2F9A3F" w:sz="8" w:space="4"/>
+          <w:bottom w:val="single" w:color="14294B" w:sz="8" w:space="4"/>
         </w:pBdr>
         <w:spacing w:before="320" w:after="140"/>
       </w:pPr>
@@ -852,7 +910,7 @@
           <w:rFonts w:ascii="Calibri" w:cs="Calibri" w:eastAsia="Calibri" w:hAnsi="Calibri"/>
           <w:b/>
           <w:bCs/>
-          <w:color w:val="2F9A3F"/>
+          <w:color w:val="14294B"/>
           <w:sz w:val="24"/>
           <w:szCs w:val="24"/>
         </w:rPr>
@@ -882,7 +940,7 @@
           <w:rFonts w:ascii="Calibri" w:cs="Calibri" w:eastAsia="Calibri" w:hAnsi="Calibri"/>
           <w:b/>
           <w:bCs/>
-          <w:color w:val="1F2A22"/>
+          <w:color w:val="14294B"/>
           <w:sz w:val="22"/>
           <w:szCs w:val="22"/>
         </w:rPr>
@@ -971,7 +1029,7 @@
           <w:rFonts w:ascii="Calibri" w:cs="Calibri" w:eastAsia="Calibri" w:hAnsi="Calibri"/>
           <w:b/>
           <w:bCs/>
-          <w:color w:val="1F2A22"/>
+          <w:color w:val="14294B"/>
           <w:sz w:val="22"/>
           <w:szCs w:val="22"/>
         </w:rPr>
@@ -1095,7 +1153,7 @@
       <w:pPr>
         <w:keepNext/>
         <w:pBdr>
-          <w:bottom w:val="single" w:color="2F9A3F" w:sz="8" w:space="4"/>
+          <w:bottom w:val="single" w:color="14294B" w:sz="8" w:space="4"/>
         </w:pBdr>
         <w:spacing w:before="0" w:after="140"/>
       </w:pPr>
@@ -1104,7 +1162,7 @@
           <w:rFonts w:ascii="Calibri" w:cs="Calibri" w:eastAsia="Calibri" w:hAnsi="Calibri"/>
           <w:b/>
           <w:bCs/>
-          <w:color w:val="2F9A3F"/>
+          <w:color w:val="14294B"/>
           <w:sz w:val="24"/>
           <w:szCs w:val="24"/>
         </w:rPr>
@@ -1135,12 +1193,12 @@
           <w:tcPr>
             <w:tcW w:type="dxa" w:w="9360"/>
             <w:tcBorders>
-              <w:top w:val="single" w:color="2F9A3F" w:sz="8"/>
-              <w:left w:val="single" w:color="2F9A3F" w:sz="8"/>
+              <w:top w:val="single" w:color="14294B" w:sz="8"/>
+              <w:left w:val="single" w:color="14294B" w:sz="8"/>
               <w:bottom w:val="none" w:color="FFFFFF" w:sz="0"/>
-              <w:right w:val="single" w:color="2F9A3F" w:sz="8"/>
-            </w:tcBorders>
-            <w:shd w:fill="2F9A3F" w:color="auto" w:val="clear"/>
+              <w:right w:val="single" w:color="14294B" w:sz="8"/>
+            </w:tcBorders>
+            <w:shd w:fill="14294B" w:color="auto" w:val="clear"/>
             <w:tcMar>
               <w:top w:type="dxa" w:w="160"/>
               <w:left w:type="dxa" w:w="240"/>
@@ -1157,7 +1215,7 @@
                 <w:rFonts w:ascii="Calibri" w:cs="Calibri" w:eastAsia="Calibri" w:hAnsi="Calibri"/>
                 <w:b/>
                 <w:bCs/>
-                <w:color w:val="D7F0DB"/>
+                <w:color w:val="F2C914"/>
                 <w:sz w:val="18"/>
                 <w:szCs w:val="18"/>
               </w:rPr>
@@ -1198,7 +1256,7 @@
             <w:r>
               <w:rPr>
                 <w:rFonts w:ascii="Calibri" w:cs="Calibri" w:eastAsia="Calibri" w:hAnsi="Calibri"/>
-                <w:color w:val="E8F5EA"/>
+                <w:color w:val="DCE3EE"/>
                 <w:sz w:val="20"/>
                 <w:szCs w:val="20"/>
               </w:rPr>
@@ -1216,9 +1274,9 @@
             <w:tcW w:type="dxa" w:w="9360"/>
             <w:tcBorders>
               <w:top w:val="none" w:color="FFFFFF" w:sz="0"/>
-              <w:left w:val="single" w:color="2F9A3F" w:sz="8"/>
-              <w:bottom w:val="single" w:color="2F9A3F" w:sz="8"/>
-              <w:right w:val="single" w:color="2F9A3F" w:sz="8"/>
+              <w:left w:val="single" w:color="14294B" w:sz="8"/>
+              <w:bottom w:val="single" w:color="14294B" w:sz="8"/>
+              <w:right w:val="single" w:color="14294B" w:sz="8"/>
             </w:tcBorders>
             <w:tcMar>
               <w:top w:type="dxa" w:w="160"/>
@@ -1236,7 +1294,7 @@
                 <w:rFonts w:ascii="Calibri" w:cs="Calibri" w:eastAsia="Calibri" w:hAnsi="Calibri"/>
                 <w:b/>
                 <w:bCs/>
-                <w:color w:val="1F2A22"/>
+                <w:color w:val="14294B"/>
                 <w:sz w:val="21"/>
                 <w:szCs w:val="21"/>
               </w:rPr>
@@ -1342,7 +1400,7 @@
                 <w:rFonts w:ascii="Calibri" w:cs="Calibri" w:eastAsia="Calibri" w:hAnsi="Calibri"/>
                 <w:i/>
                 <w:iCs/>
-                <w:color w:val="5F6368"/>
+                <w:color w:val="5B6472"/>
                 <w:sz w:val="19"/>
                 <w:szCs w:val="19"/>
               </w:rPr>
@@ -1381,12 +1439,12 @@
           <w:tcPr>
             <w:tcW w:type="dxa" w:w="9360"/>
             <w:tcBorders>
-              <w:top w:val="single" w:color="2F9A3F" w:sz="8"/>
-              <w:left w:val="single" w:color="2F9A3F" w:sz="8"/>
+              <w:top w:val="single" w:color="14294B" w:sz="8"/>
+              <w:left w:val="single" w:color="14294B" w:sz="8"/>
               <w:bottom w:val="none" w:color="FFFFFF" w:sz="0"/>
-              <w:right w:val="single" w:color="2F9A3F" w:sz="8"/>
-            </w:tcBorders>
-            <w:shd w:fill="2F9A3F" w:color="auto" w:val="clear"/>
+              <w:right w:val="single" w:color="14294B" w:sz="8"/>
+            </w:tcBorders>
+            <w:shd w:fill="14294B" w:color="auto" w:val="clear"/>
             <w:tcMar>
               <w:top w:type="dxa" w:w="160"/>
               <w:left w:type="dxa" w:w="240"/>
@@ -1403,7 +1461,7 @@
                 <w:rFonts w:ascii="Calibri" w:cs="Calibri" w:eastAsia="Calibri" w:hAnsi="Calibri"/>
                 <w:b/>
                 <w:bCs/>
-                <w:color w:val="D7F0DB"/>
+                <w:color w:val="F2C914"/>
                 <w:sz w:val="18"/>
                 <w:szCs w:val="18"/>
               </w:rPr>
@@ -1444,7 +1502,7 @@
             <w:r>
               <w:rPr>
                 <w:rFonts w:ascii="Calibri" w:cs="Calibri" w:eastAsia="Calibri" w:hAnsi="Calibri"/>
-                <w:color w:val="E8F5EA"/>
+                <w:color w:val="DCE3EE"/>
                 <w:sz w:val="20"/>
                 <w:szCs w:val="20"/>
               </w:rPr>
@@ -1462,9 +1520,9 @@
             <w:tcW w:type="dxa" w:w="9360"/>
             <w:tcBorders>
               <w:top w:val="none" w:color="FFFFFF" w:sz="0"/>
-              <w:left w:val="single" w:color="2F9A3F" w:sz="8"/>
-              <w:bottom w:val="single" w:color="2F9A3F" w:sz="8"/>
-              <w:right w:val="single" w:color="2F9A3F" w:sz="8"/>
+              <w:left w:val="single" w:color="14294B" w:sz="8"/>
+              <w:bottom w:val="single" w:color="14294B" w:sz="8"/>
+              <w:right w:val="single" w:color="14294B" w:sz="8"/>
             </w:tcBorders>
             <w:tcMar>
               <w:top w:type="dxa" w:w="160"/>
@@ -1482,7 +1540,7 @@
                 <w:rFonts w:ascii="Calibri" w:cs="Calibri" w:eastAsia="Calibri" w:hAnsi="Calibri"/>
                 <w:b/>
                 <w:bCs/>
-                <w:color w:val="1F2A22"/>
+                <w:color w:val="14294B"/>
                 <w:sz w:val="21"/>
                 <w:szCs w:val="21"/>
               </w:rPr>
@@ -1588,7 +1646,7 @@
                 <w:rFonts w:ascii="Calibri" w:cs="Calibri" w:eastAsia="Calibri" w:hAnsi="Calibri"/>
                 <w:i/>
                 <w:iCs/>
-                <w:color w:val="5F6368"/>
+                <w:color w:val="5B6472"/>
                 <w:sz w:val="19"/>
                 <w:szCs w:val="19"/>
               </w:rPr>
@@ -1607,7 +1665,7 @@
       <w:pPr>
         <w:keepNext/>
         <w:pBdr>
-          <w:bottom w:val="single" w:color="2F9A3F" w:sz="8" w:space="4"/>
+          <w:bottom w:val="single" w:color="14294B" w:sz="8" w:space="4"/>
         </w:pBdr>
         <w:spacing w:before="0" w:after="140"/>
       </w:pPr>
@@ -1616,7 +1674,7 @@
           <w:rFonts w:ascii="Calibri" w:cs="Calibri" w:eastAsia="Calibri" w:hAnsi="Calibri"/>
           <w:b/>
           <w:bCs/>
-          <w:color w:val="2F9A3F"/>
+          <w:color w:val="14294B"/>
           <w:sz w:val="24"/>
           <w:szCs w:val="24"/>
         </w:rPr>
@@ -1685,7 +1743,7 @@
               <w:bottom w:val="single" w:color="D9DDE1" w:sz="4"/>
               <w:right w:val="single" w:color="D9DDE1" w:sz="4"/>
             </w:tcBorders>
-            <w:shd w:fill="2F9A3F" w:color="auto" w:val="clear"/>
+            <w:shd w:fill="14294B" w:color="auto" w:val="clear"/>
             <w:tcMar>
               <w:top w:type="dxa" w:w="90"/>
               <w:left w:type="dxa" w:w="140"/>
@@ -1720,7 +1778,7 @@
               <w:bottom w:val="single" w:color="D9DDE1" w:sz="4"/>
               <w:right w:val="single" w:color="D9DDE1" w:sz="4"/>
             </w:tcBorders>
-            <w:shd w:fill="2F9A3F" w:color="auto" w:val="clear"/>
+            <w:shd w:fill="14294B" w:color="auto" w:val="clear"/>
             <w:tcMar>
               <w:top w:type="dxa" w:w="90"/>
               <w:left w:type="dxa" w:w="140"/>
@@ -1755,7 +1813,7 @@
               <w:bottom w:val="single" w:color="D9DDE1" w:sz="4"/>
               <w:right w:val="single" w:color="D9DDE1" w:sz="4"/>
             </w:tcBorders>
-            <w:shd w:fill="2F9A3F" w:color="auto" w:val="clear"/>
+            <w:shd w:fill="14294B" w:color="auto" w:val="clear"/>
             <w:tcMar>
               <w:top w:type="dxa" w:w="90"/>
               <w:left w:type="dxa" w:w="140"/>
@@ -2198,7 +2256,7 @@
           <w:rFonts w:ascii="Calibri" w:cs="Calibri" w:eastAsia="Calibri" w:hAnsi="Calibri"/>
           <w:i/>
           <w:iCs/>
-          <w:color w:val="5F6368"/>
+          <w:color w:val="5B6472"/>
           <w:sz w:val="19"/>
           <w:szCs w:val="19"/>
         </w:rPr>
@@ -2209,7 +2267,7 @@
       <w:pPr>
         <w:keepNext/>
         <w:pBdr>
-          <w:bottom w:val="single" w:color="2F9A3F" w:sz="8" w:space="4"/>
+          <w:bottom w:val="single" w:color="14294B" w:sz="8" w:space="4"/>
         </w:pBdr>
         <w:spacing w:before="320" w:after="140"/>
       </w:pPr>
@@ -2218,7 +2276,7 @@
           <w:rFonts w:ascii="Calibri" w:cs="Calibri" w:eastAsia="Calibri" w:hAnsi="Calibri"/>
           <w:b/>
           <w:bCs/>
-          <w:color w:val="2F9A3F"/>
+          <w:color w:val="14294B"/>
           <w:sz w:val="24"/>
           <w:szCs w:val="24"/>
         </w:rPr>
@@ -2269,7 +2327,7 @@
               <w:bottom w:val="single" w:color="D9DDE1" w:sz="4"/>
               <w:right w:val="single" w:color="D9DDE1" w:sz="4"/>
             </w:tcBorders>
-            <w:shd w:fill="2F9A3F" w:color="auto" w:val="clear"/>
+            <w:shd w:fill="14294B" w:color="auto" w:val="clear"/>
             <w:tcMar>
               <w:top w:type="dxa" w:w="90"/>
               <w:left w:type="dxa" w:w="140"/>
@@ -2304,7 +2362,7 @@
               <w:bottom w:val="single" w:color="D9DDE1" w:sz="4"/>
               <w:right w:val="single" w:color="D9DDE1" w:sz="4"/>
             </w:tcBorders>
-            <w:shd w:fill="2F9A3F" w:color="auto" w:val="clear"/>
+            <w:shd w:fill="14294B" w:color="auto" w:val="clear"/>
             <w:tcMar>
               <w:top w:type="dxa" w:w="90"/>
               <w:left w:type="dxa" w:w="140"/>
@@ -2339,7 +2397,7 @@
               <w:bottom w:val="single" w:color="D9DDE1" w:sz="4"/>
               <w:right w:val="single" w:color="D9DDE1" w:sz="4"/>
             </w:tcBorders>
-            <w:shd w:fill="2F9A3F" w:color="auto" w:val="clear"/>
+            <w:shd w:fill="14294B" w:color="auto" w:val="clear"/>
             <w:tcMar>
               <w:top w:type="dxa" w:w="90"/>
               <w:left w:type="dxa" w:w="140"/>
@@ -2985,7 +3043,7 @@
           <w:rFonts w:ascii="Calibri" w:cs="Calibri" w:eastAsia="Calibri" w:hAnsi="Calibri"/>
           <w:i/>
           <w:iCs/>
-          <w:color w:val="5F6368"/>
+          <w:color w:val="5B6472"/>
           <w:sz w:val="19"/>
           <w:szCs w:val="19"/>
         </w:rPr>
@@ -3001,7 +3059,7 @@
       <w:pPr>
         <w:keepNext/>
         <w:pBdr>
-          <w:bottom w:val="single" w:color="2F9A3F" w:sz="8" w:space="4"/>
+          <w:bottom w:val="single" w:color="14294B" w:sz="8" w:space="4"/>
         </w:pBdr>
         <w:spacing w:before="0" w:after="140"/>
       </w:pPr>
@@ -3010,7 +3068,7 @@
           <w:rFonts w:ascii="Calibri" w:cs="Calibri" w:eastAsia="Calibri" w:hAnsi="Calibri"/>
           <w:b/>
           <w:bCs/>
-          <w:color w:val="2F9A3F"/>
+          <w:color w:val="14294B"/>
           <w:sz w:val="24"/>
           <w:szCs w:val="24"/>
         </w:rPr>
@@ -3061,7 +3119,7 @@
               <w:bottom w:val="single" w:color="D9DDE1" w:sz="4"/>
               <w:right w:val="single" w:color="D9DDE1" w:sz="4"/>
             </w:tcBorders>
-            <w:shd w:fill="2F9A3F" w:color="auto" w:val="clear"/>
+            <w:shd w:fill="14294B" w:color="auto" w:val="clear"/>
             <w:tcMar>
               <w:top w:type="dxa" w:w="90"/>
               <w:left w:type="dxa" w:w="140"/>
@@ -3096,7 +3154,7 @@
               <w:bottom w:val="single" w:color="D9DDE1" w:sz="4"/>
               <w:right w:val="single" w:color="D9DDE1" w:sz="4"/>
             </w:tcBorders>
-            <w:shd w:fill="2F9A3F" w:color="auto" w:val="clear"/>
+            <w:shd w:fill="14294B" w:color="auto" w:val="clear"/>
             <w:tcMar>
               <w:top w:type="dxa" w:w="90"/>
               <w:left w:type="dxa" w:w="140"/>
@@ -3131,7 +3189,7 @@
               <w:bottom w:val="single" w:color="D9DDE1" w:sz="4"/>
               <w:right w:val="single" w:color="D9DDE1" w:sz="4"/>
             </w:tcBorders>
-            <w:shd w:fill="2F9A3F" w:color="auto" w:val="clear"/>
+            <w:shd w:fill="14294B" w:color="auto" w:val="clear"/>
             <w:tcMar>
               <w:top w:type="dxa" w:w="90"/>
               <w:left w:type="dxa" w:w="140"/>
@@ -4081,7 +4139,7 @@
           <w:rFonts w:ascii="Calibri" w:cs="Calibri" w:eastAsia="Calibri" w:hAnsi="Calibri"/>
           <w:b/>
           <w:bCs/>
-          <w:color w:val="1F2A22"/>
+          <w:color w:val="14294B"/>
           <w:sz w:val="22"/>
           <w:szCs w:val="22"/>
         </w:rPr>
@@ -4188,7 +4246,7 @@
           <w:rFonts w:ascii="Calibri" w:cs="Calibri" w:eastAsia="Calibri" w:hAnsi="Calibri"/>
           <w:b/>
           <w:bCs/>
-          <w:color w:val="1F2A22"/>
+          <w:color w:val="14294B"/>
           <w:sz w:val="22"/>
           <w:szCs w:val="22"/>
         </w:rPr>
@@ -4258,7 +4316,7 @@
           <w:rFonts w:ascii="Calibri" w:cs="Calibri" w:eastAsia="Calibri" w:hAnsi="Calibri"/>
           <w:b/>
           <w:bCs/>
-          <w:color w:val="2F9A3F"/>
+          <w:color w:val="14294B"/>
           <w:sz w:val="21"/>
           <w:szCs w:val="21"/>
         </w:rPr>
@@ -4282,7 +4340,7 @@
       <w:pPr>
         <w:keepNext/>
         <w:pBdr>
-          <w:bottom w:val="single" w:color="2F9A3F" w:sz="8" w:space="4"/>
+          <w:bottom w:val="single" w:color="14294B" w:sz="8" w:space="4"/>
         </w:pBdr>
         <w:spacing w:before="0" w:after="140"/>
       </w:pPr>
@@ -4291,7 +4349,7 @@
           <w:rFonts w:ascii="Calibri" w:cs="Calibri" w:eastAsia="Calibri" w:hAnsi="Calibri"/>
           <w:b/>
           <w:bCs/>
-          <w:color w:val="2F9A3F"/>
+          <w:color w:val="14294B"/>
           <w:sz w:val="24"/>
           <w:szCs w:val="24"/>
         </w:rPr>
@@ -4392,7 +4450,7 @@
       <w:pPr>
         <w:keepNext/>
         <w:pBdr>
-          <w:bottom w:val="single" w:color="2F9A3F" w:sz="8" w:space="4"/>
+          <w:bottom w:val="single" w:color="14294B" w:sz="8" w:space="4"/>
         </w:pBdr>
         <w:spacing w:before="320" w:after="140"/>
       </w:pPr>
@@ -4401,7 +4459,7 @@
           <w:rFonts w:ascii="Calibri" w:cs="Calibri" w:eastAsia="Calibri" w:hAnsi="Calibri"/>
           <w:b/>
           <w:bCs/>
-          <w:color w:val="2F9A3F"/>
+          <w:color w:val="14294B"/>
           <w:sz w:val="24"/>
           <w:szCs w:val="24"/>
         </w:rPr>
@@ -4511,7 +4569,7 @@
           <w:tcPr>
             <w:tcW w:type="dxa" w:w="4380"/>
             <w:tcBorders>
-              <w:top w:val="single" w:color="1F2A22" w:sz="6"/>
+              <w:top w:val="single" w:color="14294B" w:sz="6"/>
               <w:left w:val="none" w:color="FFFFFF" w:sz="0"/>
               <w:bottom w:val="none" w:color="FFFFFF" w:sz="0"/>
               <w:right w:val="none" w:color="FFFFFF" w:sz="0"/>
@@ -4540,11 +4598,11 @@
             <w:r>
               <w:rPr>
                 <w:rFonts w:ascii="Calibri" w:cs="Calibri" w:eastAsia="Calibri" w:hAnsi="Calibri"/>
-                <w:color w:val="5F6368"/>
+                <w:color w:val="5B6472"/>
                 <w:sz w:val="19"/>
                 <w:szCs w:val="19"/>
               </w:rPr>
-              <w:t xml:space="preserve">Desarrollador</w:t>
+              <w:t xml:space="preserve">Desoftech</w:t>
             </w:r>
           </w:p>
         </w:tc>
@@ -4564,7 +4622,7 @@
           <w:tcPr>
             <w:tcW w:type="dxa" w:w="4380"/>
             <w:tcBorders>
-              <w:top w:val="single" w:color="1F2A22" w:sz="6"/>
+              <w:top w:val="single" w:color="14294B" w:sz="6"/>
               <w:left w:val="none" w:color="FFFFFF" w:sz="0"/>
               <w:bottom w:val="none" w:color="FFFFFF" w:sz="0"/>
               <w:right w:val="none" w:color="FFFFFF" w:sz="0"/>
@@ -4593,7 +4651,7 @@
             <w:r>
               <w:rPr>
                 <w:rFonts w:ascii="Calibri" w:cs="Calibri" w:eastAsia="Calibri" w:hAnsi="Calibri"/>
-                <w:color w:val="5F6368"/>
+                <w:color w:val="5B6472"/>
                 <w:sz w:val="19"/>
                 <w:szCs w:val="19"/>
               </w:rPr>
@@ -4631,16 +4689,16 @@
     <w:r>
       <w:rPr>
         <w:rFonts w:ascii="Calibri" w:cs="Calibri" w:eastAsia="Calibri" w:hAnsi="Calibri"/>
-        <w:color w:val="5F6368"/>
+        <w:color w:val="5B6472"/>
         <w:sz w:val="16"/>
         <w:szCs w:val="16"/>
       </w:rPr>
-      <w:t xml:space="preserve">Ramiro Tello · Desarrollo web    |    Página </w:t>
+      <w:t xml:space="preserve">Desoftech · Desarrollo de software y tecnología    |    Página </w:t>
     </w:r>
     <w:r>
       <w:rPr>
         <w:rFonts w:ascii="Calibri" w:cs="Calibri" w:eastAsia="Calibri" w:hAnsi="Calibri"/>
-        <w:color w:val="5F6368"/>
+        <w:color w:val="5B6472"/>
         <w:sz w:val="16"/>
         <w:szCs w:val="16"/>
       </w:rPr>
@@ -4652,7 +4710,7 @@
     <w:r>
       <w:rPr>
         <w:rFonts w:ascii="Calibri" w:cs="Calibri" w:eastAsia="Calibri" w:hAnsi="Calibri"/>
-        <w:color w:val="5F6368"/>
+        <w:color w:val="5B6472"/>
         <w:sz w:val="16"/>
         <w:szCs w:val="16"/>
       </w:rPr>
@@ -4661,7 +4719,7 @@
     <w:r>
       <w:rPr>
         <w:rFonts w:ascii="Calibri" w:cs="Calibri" w:eastAsia="Calibri" w:hAnsi="Calibri"/>
-        <w:color w:val="5F6368"/>
+        <w:color w:val="5B6472"/>
         <w:sz w:val="16"/>
         <w:szCs w:val="16"/>
       </w:rPr>
@@ -4715,16 +4773,66 @@
 <w:hdr xmlns:wpc="http://schemas.microsoft.com/office/word/2010/wordprocessingCanvas" xmlns:mc="http://schemas.openxmlformats.org/markup-compatibility/2006" xmlns:o="urn:schemas-microsoft-com:office:office" xmlns:r="http://schemas.openxmlformats.org/officeDocument/2006/relationships" xmlns:m="http://schemas.openxmlformats.org/officeDocument/2006/math" xmlns:v="urn:schemas-microsoft-com:vml" xmlns:wp14="http://schemas.microsoft.com/office/word/2010/wordprocessingDrawing" xmlns:wp="http://schemas.openxmlformats.org/drawingml/2006/wordprocessingDrawing" xmlns:w10="urn:schemas-microsoft-com:office:word" xmlns:w="http://schemas.openxmlformats.org/wordprocessingml/2006/main" xmlns:w14="http://schemas.microsoft.com/office/word/2010/wordml" xmlns:w15="http://schemas.microsoft.com/office/word/2012/wordml" xmlns:wpg="http://schemas.microsoft.com/office/word/2010/wordprocessingGroup" xmlns:wpi="http://schemas.microsoft.com/office/word/2010/wordprocessingInk" xmlns:wne="http://schemas.microsoft.com/office/word/2006/wordml" xmlns:wps="http://schemas.microsoft.com/office/word/2010/wordprocessingShape" xmlns:cx="http://schemas.microsoft.com/office/drawing/2014/chartex" xmlns:cx1="http://schemas.microsoft.com/office/drawing/2015/9/8/chartex" xmlns:cx2="http://schemas.microsoft.com/office/drawing/2015/10/21/chartex" xmlns:cx3="http://schemas.microsoft.com/office/drawing/2016/5/9/chartex" xmlns:cx4="http://schemas.microsoft.com/office/drawing/2016/5/10/chartex" xmlns:cx5="http://schemas.microsoft.com/office/drawing/2016/5/11/chartex" xmlns:cx6="http://schemas.microsoft.com/office/drawing/2016/5/12/chartex" xmlns:cx7="http://schemas.microsoft.com/office/drawing/2016/5/13/chartex" xmlns:cx8="http://schemas.microsoft.com/office/drawing/2016/5/14/chartex" xmlns:w16cid="http://schemas.microsoft.com/office/word/2016/wordml/cid" xmlns:w16se="http://schemas.microsoft.com/office/word/2015/wordml/symex">
   <w:p>
     <w:pPr>
-      <w:jc w:val="right"/>
+      <w:tabs>
+        <w:tab w:val="right" w:pos="9360"/>
+      </w:tabs>
     </w:pPr>
+    <w:r>
+      <w:drawing>
+        <wp:inline distT="0" distB="0" distL="0" distR="0">
+          <wp:extent cx="914400" cy="152400"/>
+          <wp:effectExtent t="0" r="0" b="0" l="0"/>
+          <wp:docPr id="1" name="" descr="" title=""/>
+          <wp:cNvGraphicFramePr>
+            <a:graphicFrameLocks xmlns:a="http://schemas.openxmlformats.org/drawingml/2006/main" noChangeAspect="1"/>
+          </wp:cNvGraphicFramePr>
+          <a:graphic xmlns:a="http://schemas.openxmlformats.org/drawingml/2006/main">
+            <a:graphicData uri="http://schemas.openxmlformats.org/drawingml/2006/picture">
+              <pic:pic xmlns:pic="http://schemas.openxmlformats.org/drawingml/2006/picture">
+                <pic:nvPicPr>
+                  <pic:cNvPr id="0" name="" descr=""/>
+                  <pic:cNvPicPr>
+                    <a:picLocks noChangeAspect="1" noChangeArrowheads="1"/>
+                  </pic:cNvPicPr>
+                </pic:nvPicPr>
+                <pic:blipFill>
+                  <a:blip r:embed="rId0" cstate="none"/>
+                  <a:srcRect/>
+                  <a:stretch>
+                    <a:fillRect/>
+                  </a:stretch>
+                </pic:blipFill>
+                <pic:spPr bwMode="auto">
+                  <a:xfrm>
+                    <a:off x="0" y="0"/>
+                    <a:ext cx="914400" cy="152400"/>
+                  </a:xfrm>
+                  <a:prstGeom prst="rect">
+                    <a:avLst/>
+                  </a:prstGeom>
+                </pic:spPr>
+              </pic:pic>
+            </a:graphicData>
+          </a:graphic>
+        </wp:inline>
+      </w:drawing>
+    </w:r>
     <w:r>
       <w:rPr>
         <w:rFonts w:ascii="Calibri" w:cs="Calibri" w:eastAsia="Calibri" w:hAnsi="Calibri"/>
-        <w:color w:val="5F6368"/>
         <w:sz w:val="16"/>
         <w:szCs w:val="16"/>
       </w:rPr>
-      <w:t xml:space="preserve">ImpleGas · Propuesta de sistema</w:t>
+      <w:t xml:space="preserve">	</w:t>
+    </w:r>
+    <w:r>
+      <w:rPr>
+        <w:rFonts w:ascii="Calibri" w:cs="Calibri" w:eastAsia="Calibri" w:hAnsi="Calibri"/>
+        <w:color w:val="5B6472"/>
+        <w:sz w:val="16"/>
+        <w:szCs w:val="16"/>
+      </w:rPr>
+      <w:t xml:space="preserve">Propuesta de sistema para ImpleGas</w:t>
     </w:r>
   </w:p>
 </w:hdr>
@@ -4827,7 +4935,7 @@
         <w:ind w:left="360" w:hanging="240"/>
       </w:pPr>
       <w:rPr>
-        <w:color w:val="2F9A3F"/>
+        <w:color w:val="14294B"/>
       </w:rPr>
     </w:lvl>
   </w:abstractNum>
@@ -4844,7 +4952,7 @@
       <w:rPr>
         <w:b/>
         <w:bCs/>
-        <w:color w:val="2F9A3F"/>
+        <w:color w:val="14294B"/>
       </w:rPr>
     </w:lvl>
   </w:abstractNum>

</xml_diff>

<commit_message>
Cotización en Word: Opción B a $1,500 al mes
Co-Authored-By: Claude Opus 5.5 (1M context) <noreply@anthropic.com>
</commit_message>
<xml_diff>
--- a/cotizacionSistema v1/Cotizacion-sistema-ImpleGas-v1.docx
+++ b/cotizacionSistema v1/Cotizacion-sistema-ImpleGas-v1.docx
@@ -894,7 +894,7 @@
           <w:sz w:val="21"/>
           <w:szCs w:val="21"/>
         </w:rPr>
-        <w:t xml:space="preserve"> $1,900 MXN al mes, con hospedaje, dominio y soporte incluidos.</w:t>
+        <w:t xml:space="preserve"> $1,500 MXN al mes, con hospedaje, dominio y soporte incluidos.</w:t>
       </w:r>
     </w:p>
     <w:p>
@@ -1497,7 +1497,7 @@
                 <w:sz w:val="40"/>
                 <w:szCs w:val="40"/>
               </w:rPr>
-              <w:t xml:space="preserve">$1,900 MXN</w:t>
+              <w:t xml:space="preserve">$1,500 MXN</w:t>
             </w:r>
             <w:r>
               <w:rPr>
@@ -2622,7 +2622,7 @@
                 <w:sz w:val="20"/>
                 <w:szCs w:val="20"/>
               </w:rPr>
-              <w:t xml:space="preserve">$1,900 MXN</w:t>
+              <w:t xml:space="preserve">$1,500 MXN</w:t>
             </w:r>
           </w:p>
         </w:tc>
@@ -2722,7 +2722,7 @@
                 <w:sz w:val="20"/>
                 <w:szCs w:val="20"/>
               </w:rPr>
-              <w:t xml:space="preserve">$22,800 MXN</w:t>
+              <w:t xml:space="preserve">$18,000 MXN</w:t>
             </w:r>
           </w:p>
         </w:tc>
@@ -2825,7 +2825,7 @@
                 <w:sz w:val="20"/>
                 <w:szCs w:val="20"/>
               </w:rPr>
-              <w:t xml:space="preserve">$45,600 MXN</w:t>
+              <w:t xml:space="preserve">$36,000 MXN</w:t>
             </w:r>
           </w:p>
         </w:tc>

</xml_diff>

<commit_message>
Cotización: web $5,000 y sistema $10,000 (pago único $15,000)
Co-Authored-By: Claude Opus 5.5 (1M context) <noreply@anthropic.com>
</commit_message>
<xml_diff>
--- a/cotizacionSistema v1/Cotizacion-sistema-ImpleGas-v1.docx
+++ b/cotizacionSistema v1/Cotizacion-sistema-ImpleGas-v1.docx
@@ -866,7 +866,7 @@
           <w:sz w:val="21"/>
           <w:szCs w:val="21"/>
         </w:rPr>
-        <w:t xml:space="preserve"> pago único de $22,000 MXN; eres dueño de todo.</w:t>
+        <w:t xml:space="preserve"> pago único de $15,000 MXN; eres dueño de todo.</w:t>
       </w:r>
     </w:p>
     <w:p>
@@ -1251,7 +1251,7 @@
                 <w:sz w:val="40"/>
                 <w:szCs w:val="40"/>
               </w:rPr>
-              <w:t xml:space="preserve">$22,000 MXN</w:t>
+              <w:t xml:space="preserve">$15,000 MXN</w:t>
             </w:r>
             <w:r>
               <w:rPr>
@@ -1316,7 +1316,7 @@
                 <w:sz w:val="21"/>
                 <w:szCs w:val="21"/>
               </w:rPr>
-              <w:t xml:space="preserve">Diseño y desarrollo de la página web: $7,000 MXN.</w:t>
+              <w:t xml:space="preserve">Diseño y desarrollo de la página web: $5,000 MXN.</w:t>
             </w:r>
           </w:p>
           <w:p>
@@ -1334,7 +1334,7 @@
                 <w:sz w:val="21"/>
                 <w:szCs w:val="21"/>
               </w:rPr>
-              <w:t xml:space="preserve">Sistema de cotizaciones y panel de administración: $15,000 MXN.</w:t>
+              <w:t xml:space="preserve">Sistema de cotizaciones y panel de administración: $10,000 MXN.</w:t>
             </w:r>
           </w:p>
           <w:p>
@@ -2488,7 +2488,7 @@
                 <w:sz w:val="20"/>
                 <w:szCs w:val="20"/>
               </w:rPr>
-              <w:t xml:space="preserve">$22,000 MXN</w:t>
+              <w:t xml:space="preserve">$15,000 MXN</w:t>
             </w:r>
           </w:p>
         </w:tc>
@@ -2691,7 +2691,7 @@
                 <w:sz w:val="20"/>
                 <w:szCs w:val="20"/>
               </w:rPr>
-              <w:t xml:space="preserve">≈ $26,900 MXN</w:t>
+              <w:t xml:space="preserve">≈ $19,900 MXN</w:t>
             </w:r>
           </w:p>
         </w:tc>
@@ -2793,7 +2793,7 @@
                 <w:sz w:val="20"/>
                 <w:szCs w:val="20"/>
               </w:rPr>
-              <w:t xml:space="preserve">≈ $31,800 MXN</w:t>
+              <w:t xml:space="preserve">≈ $24,800 MXN</w:t>
             </w:r>
           </w:p>
         </w:tc>

</xml_diff>

<commit_message>
Cotización: sistema $12,000 (pago único $17,000)
Co-Authored-By: Claude Opus 5.5 (1M context) <noreply@anthropic.com>
</commit_message>
<xml_diff>
--- a/cotizacionSistema v1/Cotizacion-sistema-ImpleGas-v1.docx
+++ b/cotizacionSistema v1/Cotizacion-sistema-ImpleGas-v1.docx
@@ -866,7 +866,7 @@
           <w:sz w:val="21"/>
           <w:szCs w:val="21"/>
         </w:rPr>
-        <w:t xml:space="preserve"> pago único de $15,000 MXN; eres dueño de todo.</w:t>
+        <w:t xml:space="preserve"> pago único de $17,000 MXN; eres dueño de todo.</w:t>
       </w:r>
     </w:p>
     <w:p>
@@ -1251,7 +1251,7 @@
                 <w:sz w:val="40"/>
                 <w:szCs w:val="40"/>
               </w:rPr>
-              <w:t xml:space="preserve">$15,000 MXN</w:t>
+              <w:t xml:space="preserve">$17,000 MXN</w:t>
             </w:r>
             <w:r>
               <w:rPr>
@@ -1334,7 +1334,7 @@
                 <w:sz w:val="21"/>
                 <w:szCs w:val="21"/>
               </w:rPr>
-              <w:t xml:space="preserve">Sistema de cotizaciones y panel de administración: $10,000 MXN.</w:t>
+              <w:t xml:space="preserve">Sistema de cotizaciones y panel de administración: $12,000 MXN.</w:t>
             </w:r>
           </w:p>
           <w:p>
@@ -2488,7 +2488,7 @@
                 <w:sz w:val="20"/>
                 <w:szCs w:val="20"/>
               </w:rPr>
-              <w:t xml:space="preserve">$15,000 MXN</w:t>
+              <w:t xml:space="preserve">$17,000 MXN</w:t>
             </w:r>
           </w:p>
         </w:tc>
@@ -2691,7 +2691,7 @@
                 <w:sz w:val="20"/>
                 <w:szCs w:val="20"/>
               </w:rPr>
-              <w:t xml:space="preserve">≈ $19,900 MXN</w:t>
+              <w:t xml:space="preserve">≈ $21,900 MXN</w:t>
             </w:r>
           </w:p>
         </w:tc>
@@ -2793,7 +2793,7 @@
                 <w:sz w:val="20"/>
                 <w:szCs w:val="20"/>
               </w:rPr>
-              <w:t xml:space="preserve">≈ $24,800 MXN</w:t>
+              <w:t xml:space="preserve">≈ $26,800 MXN</w:t>
             </w:r>
           </w:p>
         </w:tc>

</xml_diff>